<commit_message>
Drop saewool, lead with Vivanz Eden, add artist photos
Per feedback the pitch is now three acts, led by Vivanz Eden:

1. Vivanz Eden (Vo. Ryoma Kikuchi)
2. Ryudai (Aoki Ryudai)
3. yuuna

Also embeds imagery throughout: an artist portrait on each opener slide
(plus a separate shot of Kikuchi on the Vivanz Eden slide) and a
thumbnail on every reference-video card, sourced from the acts' public
TikTok profiles, video covers, YouTube thumbnails and Spotify artist
photos. fetch_images.py collects and normalises them.

Adds render_preview.py, an approximate slide renderer built on
python-pptx and PIL, because LibreOffice conversion does not work in
this environment and the layout still needs a visual check.

Deck is now 17 slides; both outputs pass schema validation and the
text-fit check.
</commit_message>
<xml_diff>
--- a/presentations/2026-07-27-new-artist/新人プレゼン資料_2026-07-27.docx
+++ b/presentations/2026-07-27-new-artist/新人プレゼン資料_2026-07-27.docx
@@ -43,7 +43,7 @@
           <w:sz w:val="24"/>
           <w:szCs w:val="24"/>
         </w:rPr>
-        <w:t xml:space="preserve">最近見つけた新人アーティスト 4組のご紹介</w:t>
+        <w:t xml:space="preserve">最近見つけた新人アーティスト 3組のご紹介</w:t>
       </w:r>
     </w:p>
     <w:tbl>
@@ -216,7 +216,7 @@
                 <w:sz w:val="19"/>
                 <w:szCs w:val="19"/>
               </w:rPr>
-              <w:t xml:space="preserve">全4組（＋追加候補枠）</w:t>
+              <w:t xml:space="preserve">全3組（＋追加候補枠）</w:t>
             </w:r>
           </w:p>
         </w:tc>
@@ -269,7 +269,7 @@
                 <w:sz w:val="19"/>
                 <w:szCs w:val="19"/>
               </w:rPr>
-              <w:t xml:space="preserve">1組5分 × 4組＝20分</w:t>
+              <w:t xml:space="preserve">1組5分 × 3組＝15分</w:t>
             </w:r>
           </w:p>
         </w:tc>
@@ -394,7 +394,7 @@
           <w:sz w:val="30"/>
           <w:szCs w:val="30"/>
         </w:rPr>
-        <w:t xml:space="preserve">0. サマリー — 4組の位置づけ</w:t>
+        <w:t xml:space="preserve">0. サマリー — 3組の位置づけ</w:t>
       </w:r>
     </w:p>
     <w:p>
@@ -642,7 +642,7 @@
                 <w:sz w:val="19"/>
                 <w:szCs w:val="19"/>
               </w:rPr>
-              <w:t xml:space="preserve">saewool</w:t>
+              <w:t xml:space="preserve">Vivanz Eden（菊地諒真）</w:t>
             </w:r>
           </w:p>
         </w:tc>
@@ -666,7 +666,7 @@
                 <w:sz w:val="19"/>
                 <w:szCs w:val="19"/>
               </w:rPr>
-              <w:t xml:space="preserve">弾き語りシンガー</w:t>
+              <w:t xml:space="preserve">3ピース／Vo本命</w:t>
             </w:r>
           </w:p>
         </w:tc>
@@ -690,7 +690,7 @@
                 <w:sz w:val="19"/>
                 <w:szCs w:val="19"/>
               </w:rPr>
-              <w:t xml:space="preserve">TikTok 8.45万 / YT 5.79万</w:t>
+              <w:t xml:space="preserve">TikTok 11.98万 / YT 3.75万</w:t>
             </w:r>
           </w:p>
         </w:tc>
@@ -714,7 +714,7 @@
                 <w:sz w:val="19"/>
                 <w:szCs w:val="19"/>
               </w:rPr>
-              <w:t xml:space="preserve">TikTok最大230万 / Spotify月間4,347</w:t>
+              <w:t xml:space="preserve">Spotify月間14万・葡萄111万</w:t>
             </w:r>
           </w:p>
         </w:tc>
@@ -738,7 +738,7 @@
                 <w:sz w:val="19"/>
                 <w:szCs w:val="19"/>
               </w:rPr>
-              <w:t xml:space="preserve">未所属（TuneCore）</w:t>
+              <w:t xml:space="preserve">インディペンデント</w:t>
             </w:r>
           </w:p>
         </w:tc>
@@ -1031,152 +1031,6 @@
                 <w:szCs w:val="19"/>
               </w:rPr>
               <w:t xml:space="preserve">未所属</w:t>
-            </w:r>
-          </w:p>
-        </w:tc>
-      </w:tr>
-      <w:tr>
-        <w:tc>
-          <w:tcPr>
-            <w:tcW w:type="dxa" w:w="520"/>
-            <w:tcMar>
-              <w:top w:type="dxa" w:w="70"/>
-              <w:left w:type="dxa" w:w="110"/>
-              <w:bottom w:type="dxa" w:w="70"/>
-              <w:right w:type="dxa" w:w="110"/>
-            </w:tcMar>
-          </w:tcPr>
-          <w:p>
-            <w:pPr>
-              <w:spacing w:after="0"/>
-            </w:pPr>
-            <w:r>
-              <w:rPr>
-                <w:color w:val="1A1A1A"/>
-                <w:sz w:val="19"/>
-                <w:szCs w:val="19"/>
-              </w:rPr>
-              <w:t xml:space="preserve">4</w:t>
-            </w:r>
-          </w:p>
-        </w:tc>
-        <w:tc>
-          <w:tcPr>
-            <w:tcW w:type="dxa" w:w="1900"/>
-            <w:tcMar>
-              <w:top w:type="dxa" w:w="70"/>
-              <w:left w:type="dxa" w:w="110"/>
-              <w:bottom w:type="dxa" w:w="70"/>
-              <w:right w:type="dxa" w:w="110"/>
-            </w:tcMar>
-          </w:tcPr>
-          <w:p>
-            <w:pPr>
-              <w:spacing w:after="0"/>
-            </w:pPr>
-            <w:r>
-              <w:rPr>
-                <w:color w:val="1A1A1A"/>
-                <w:sz w:val="19"/>
-                <w:szCs w:val="19"/>
-              </w:rPr>
-              <w:t xml:space="preserve">Vivanz Eden（菊地諒真）</w:t>
-            </w:r>
-          </w:p>
-        </w:tc>
-        <w:tc>
-          <w:tcPr>
-            <w:tcW w:type="dxa" w:w="1500"/>
-            <w:tcMar>
-              <w:top w:type="dxa" w:w="70"/>
-              <w:left w:type="dxa" w:w="110"/>
-              <w:bottom w:type="dxa" w:w="70"/>
-              <w:right w:type="dxa" w:w="110"/>
-            </w:tcMar>
-          </w:tcPr>
-          <w:p>
-            <w:pPr>
-              <w:spacing w:after="0"/>
-            </w:pPr>
-            <w:r>
-              <w:rPr>
-                <w:color w:val="1A1A1A"/>
-                <w:sz w:val="19"/>
-                <w:szCs w:val="19"/>
-              </w:rPr>
-              <w:t xml:space="preserve">3ピース／Vo本命</w:t>
-            </w:r>
-          </w:p>
-        </w:tc>
-        <w:tc>
-          <w:tcPr>
-            <w:tcW w:type="dxa" w:w="1900"/>
-            <w:tcMar>
-              <w:top w:type="dxa" w:w="70"/>
-              <w:left w:type="dxa" w:w="110"/>
-              <w:bottom w:type="dxa" w:w="70"/>
-              <w:right w:type="dxa" w:w="110"/>
-            </w:tcMar>
-          </w:tcPr>
-          <w:p>
-            <w:pPr>
-              <w:spacing w:after="0"/>
-            </w:pPr>
-            <w:r>
-              <w:rPr>
-                <w:color w:val="1A1A1A"/>
-                <w:sz w:val="19"/>
-                <w:szCs w:val="19"/>
-              </w:rPr>
-              <w:t xml:space="preserve">TikTok 11.98万 / YT 3.75万</w:t>
-            </w:r>
-          </w:p>
-        </w:tc>
-        <w:tc>
-          <w:tcPr>
-            <w:tcW w:type="dxa" w:w="2080"/>
-            <w:tcMar>
-              <w:top w:type="dxa" w:w="70"/>
-              <w:left w:type="dxa" w:w="110"/>
-              <w:bottom w:type="dxa" w:w="70"/>
-              <w:right w:type="dxa" w:w="110"/>
-            </w:tcMar>
-          </w:tcPr>
-          <w:p>
-            <w:pPr>
-              <w:spacing w:after="0"/>
-            </w:pPr>
-            <w:r>
-              <w:rPr>
-                <w:color w:val="1A1A1A"/>
-                <w:sz w:val="19"/>
-                <w:szCs w:val="19"/>
-              </w:rPr>
-              <w:t xml:space="preserve">Spotify月間14万・葡萄111万</w:t>
-            </w:r>
-          </w:p>
-        </w:tc>
-        <w:tc>
-          <w:tcPr>
-            <w:tcW w:type="dxa" w:w="1800"/>
-            <w:tcMar>
-              <w:top w:type="dxa" w:w="70"/>
-              <w:left w:type="dxa" w:w="110"/>
-              <w:bottom w:type="dxa" w:w="70"/>
-              <w:right w:type="dxa" w:w="110"/>
-            </w:tcMar>
-          </w:tcPr>
-          <w:p>
-            <w:pPr>
-              <w:spacing w:after="0"/>
-            </w:pPr>
-            <w:r>
-              <w:rPr>
-                <w:color w:val="1A1A1A"/>
-                <w:sz w:val="19"/>
-                <w:szCs w:val="19"/>
-              </w:rPr>
-              <w:t xml:space="preserve">インディペンデント</w:t>
             </w:r>
           </w:p>
         </w:tc>
@@ -1228,15 +1082,15 @@
           <w:sz w:val="21"/>
           <w:szCs w:val="21"/>
         </w:rPr>
-        <w:t xml:space="preserve">saewool　</w:t>
-      </w:r>
-      <w:r>
-        <w:rPr>
-          <w:color w:val="1A1A1A"/>
-          <w:sz w:val="21"/>
-          <w:szCs w:val="21"/>
-        </w:rPr>
-        <w:t xml:space="preserve">リーチはあるがDSPに落ちていない</w:t>
+        <w:t xml:space="preserve">Vivanz Eden（菊地諒真）　</w:t>
+      </w:r>
+      <w:r>
+        <w:rPr>
+          <w:color w:val="1A1A1A"/>
+          <w:sz w:val="21"/>
+          <w:szCs w:val="21"/>
+        </w:rPr>
+        <w:t xml:space="preserve">実需あり、供給が追いつかない</w:t>
       </w:r>
     </w:p>
     <w:p>
@@ -1296,52 +1150,24 @@
       </w:r>
     </w:p>
     <w:p>
-      <w:pPr>
-        <w:pStyle w:val="ListParagraph"/>
-        <w:numPr>
-          <w:ilvl w:val="0"/>
-          <w:numId w:val="2"/>
-        </w:numPr>
-        <w:spacing w:after="110"/>
+      <w:r>
+        <w:br w:type="page"/>
+      </w:r>
+    </w:p>
+    <w:p>
+      <w:pPr>
+        <w:pStyle w:val="Heading1"/>
+        <w:spacing w:after="160" w:before="320"/>
       </w:pPr>
       <w:r>
         <w:rPr>
           <w:b/>
           <w:bCs/>
           <w:color w:val="1A1A1A"/>
-          <w:sz w:val="21"/>
-          <w:szCs w:val="21"/>
-        </w:rPr>
-        <w:t xml:space="preserve">Vivanz Eden（菊地諒真）　</w:t>
-      </w:r>
-      <w:r>
-        <w:rPr>
-          <w:color w:val="1A1A1A"/>
-          <w:sz w:val="21"/>
-          <w:szCs w:val="21"/>
-        </w:rPr>
-        <w:t xml:space="preserve">実需あり、供給が追いつかない</w:t>
-      </w:r>
-    </w:p>
-    <w:p>
-      <w:r>
-        <w:br w:type="page"/>
-      </w:r>
-    </w:p>
-    <w:p>
-      <w:pPr>
-        <w:pStyle w:val="Heading1"/>
-        <w:spacing w:after="160" w:before="320"/>
-      </w:pPr>
-      <w:r>
-        <w:rPr>
-          <w:b/>
-          <w:bCs/>
-          <w:color w:val="1A1A1A"/>
           <w:sz w:val="30"/>
           <w:szCs w:val="30"/>
         </w:rPr>
-        <w:t xml:space="preserve">1. saewool　（セウル）</w:t>
+        <w:t xml:space="preserve">1. Vivanz Eden　（ヴィバンズエデン ／ Vo・Gt 菊地諒真）</w:t>
       </w:r>
     </w:p>
     <w:p>
@@ -1356,7 +1182,7 @@
           <w:sz w:val="20"/>
           <w:szCs w:val="20"/>
         </w:rPr>
-        <w:t xml:space="preserve">弾き語りシンガー／ソロ</w:t>
+        <w:t xml:space="preserve">3ピースバンド／本命は菊地のボーカル</w:t>
       </w:r>
       <w:r>
         <w:rPr>
@@ -1372,7 +1198,7 @@
           <w:sz w:val="20"/>
           <w:szCs w:val="20"/>
         </w:rPr>
-        <w:t xml:space="preserve">レーベル未所属（TuneCore Japanで自主配信）</w:t>
+        <w:t xml:space="preserve">インディペンデント（レーベル未所属／自主流通・ライブは自力で完売）</w:t>
       </w:r>
     </w:p>
     <w:tbl>
@@ -1429,7 +1255,7 @@
                 <w:sz w:val="28"/>
                 <w:szCs w:val="28"/>
               </w:rPr>
-              <w:t xml:space="preserve">「再生されるより、「保存」される声。」</w:t>
+              <w:t xml:space="preserve">「「葡萄」で証明済み。次のback numberは、この声から。」</w:t>
             </w:r>
           </w:p>
           <w:p>
@@ -1442,7 +1268,7 @@
                 <w:sz w:val="19"/>
                 <w:szCs w:val="19"/>
               </w:rPr>
-              <w:t xml:space="preserve">韓国発・日本語で刺す弾き語り。2.3M再生の裏に、保存3.5万。</w:t>
+              <w:t xml:space="preserve">Spotify月間14万リスナー／初ワンマン東名阪SOLD OUT／全曲 菊地諒真 作詞作曲。</w:t>
             </w:r>
           </w:p>
         </w:tc>
@@ -1463,6 +1289,19 @@
     </w:p>
     <w:p>
       <w:pPr>
+        <w:spacing w:after="160" w:before="0"/>
+      </w:pPr>
+      <w:r>
+        <w:rPr>
+          <w:color w:val="B3261E"/>
+          <w:sz w:val="19"/>
+          <w:szCs w:val="19"/>
+        </w:rPr>
+        <w:t xml:space="preserve">※ 正式表記は「菊地諒真」（“菊池涼馬”ではありません）。前回2025/7/22の新人プレゼンで当部門から提出済み → 今回は「バンド」ではなく「菊地のボーカル」を軸に再提案。</w:t>
+      </w:r>
+    </w:p>
+    <w:p>
+      <w:pPr>
         <w:pStyle w:val="Heading2"/>
         <w:spacing w:after="110" w:before="240"/>
       </w:pPr>
@@ -1487,7 +1326,7 @@
           <w:sz w:val="21"/>
           <w:szCs w:val="21"/>
         </w:rPr>
-        <w:t xml:space="preserve">韓国を拠点に、日本語のJ-POP／ボカロ／アニソンをアコースティック弾き語りでカバーするソロシンガー。カバー1本で100万〜230万再生を複数本持ちながら、レーベル未所属・TuneCoreでの自主流通のまま。</w:t>
+        <w:t xml:space="preserve">2024年1月始動の3ピース。菊地諒真（Vo/Gt）、Kaoru（Ba）、湊大輝（Dr）。「葡萄」がSpotify111万再生を突破し月間リスナー14万、初ワンマンツアー『only blue』（8/15大阪・8/28東京）は両公演SOLD OUT。楽曲は全て菊地の作詞作曲。ROJACK掲載時のコピーは「圧倒的歌唱力で魅せる、カオスなスリーピースバンド」。</w:t>
       </w:r>
     </w:p>
     <w:p>
@@ -1547,7 +1386,7 @@
                 <w:sz w:val="30"/>
                 <w:szCs w:val="30"/>
               </w:rPr>
-              <w:t xml:space="preserve">8.45万</w:t>
+              <w:t xml:space="preserve">14.0万</w:t>
             </w:r>
           </w:p>
         </w:tc>
@@ -1573,7 +1412,7 @@
                 <w:sz w:val="30"/>
                 <w:szCs w:val="30"/>
               </w:rPr>
-              <w:t xml:space="preserve">230万</w:t>
+              <w:t xml:space="preserve">111万</w:t>
             </w:r>
           </w:p>
         </w:tc>
@@ -1599,7 +1438,7 @@
                 <w:sz w:val="30"/>
                 <w:szCs w:val="30"/>
               </w:rPr>
-              <w:t xml:space="preserve">4,347</w:t>
+              <w:t xml:space="preserve">SOLD OUT</w:t>
             </w:r>
           </w:p>
         </w:tc>
@@ -1625,7 +1464,7 @@
                 <w:sz w:val="30"/>
                 <w:szCs w:val="30"/>
               </w:rPr>
-              <w:t xml:space="preserve">3.1%</w:t>
+              <w:t xml:space="preserve">130万</w:t>
             </w:r>
           </w:p>
         </w:tc>
@@ -1651,7 +1490,7 @@
                 <w:sz w:val="17"/>
                 <w:szCs w:val="17"/>
               </w:rPr>
-              <w:t xml:space="preserve">TikTokフォロワー</w:t>
+              <w:t xml:space="preserve">Spotify月間リスナー</w:t>
             </w:r>
           </w:p>
         </w:tc>
@@ -1675,7 +1514,7 @@
                 <w:sz w:val="17"/>
                 <w:szCs w:val="17"/>
               </w:rPr>
-              <w:t xml:space="preserve">最大再生（1本）</w:t>
+              <w:t xml:space="preserve">「葡萄」Spotify再生</w:t>
             </w:r>
           </w:p>
         </w:tc>
@@ -1699,7 +1538,7 @@
                 <w:sz w:val="17"/>
                 <w:szCs w:val="17"/>
               </w:rPr>
-              <w:t xml:space="preserve">Spotify月間リスナー</w:t>
+              <w:t xml:space="preserve">初ワンマン 東京・大阪 両公演</w:t>
             </w:r>
           </w:p>
         </w:tc>
@@ -1723,7 +1562,7 @@
                 <w:sz w:val="17"/>
                 <w:szCs w:val="17"/>
               </w:rPr>
-              <w:t xml:space="preserve">保存率（1.4M再生／4.3万保存）</w:t>
+              <w:t xml:space="preserve">TikTok最大再生（葡萄クリップ）</w:t>
             </w:r>
           </w:p>
         </w:tc>
@@ -1936,7 +1775,7 @@
                 <w:sz w:val="19"/>
                 <w:szCs w:val="19"/>
               </w:rPr>
-              <w:t xml:space="preserve">@saewool</w:t>
+              <w:t xml:space="preserve">@vivanzeden_jp</w:t>
             </w:r>
           </w:p>
         </w:tc>
@@ -1962,7 +1801,7 @@
                 <w:sz w:val="19"/>
                 <w:szCs w:val="19"/>
               </w:rPr>
-              <w:t xml:space="preserve">フォロワー 8.45万</w:t>
+              <w:t xml:space="preserve">フォロワー 11.98万</w:t>
             </w:r>
           </w:p>
         </w:tc>
@@ -1986,7 +1825,7 @@
                 <w:sz w:val="17"/>
                 <w:szCs w:val="17"/>
               </w:rPr>
-              <w:t xml:space="preserve">総いいね 190万 / 96投稿</w:t>
+              <w:t xml:space="preserve">総いいね 230万 / 423投稿 / 認証済みアカウント</w:t>
             </w:r>
           </w:p>
         </w:tc>
@@ -2038,7 +1877,7 @@
                 <w:sz w:val="19"/>
                 <w:szCs w:val="19"/>
               </w:rPr>
-              <w:t xml:space="preserve">@saewool_</w:t>
+              <w:t xml:space="preserve">@vivanzedenjp</w:t>
             </w:r>
           </w:p>
         </w:tc>
@@ -2064,7 +1903,7 @@
                 <w:sz w:val="19"/>
                 <w:szCs w:val="19"/>
               </w:rPr>
-              <w:t xml:space="preserve">登録者 5.79万</w:t>
+              <w:t xml:space="preserve">登録者 3.75万</w:t>
             </w:r>
           </w:p>
         </w:tc>
@@ -2088,7 +1927,7 @@
                 <w:sz w:val="17"/>
                 <w:szCs w:val="17"/>
               </w:rPr>
-              <w:t xml:space="preserve">総再生 622.7万 / 109本 / 2020年開設・チャンネル国=韓国</w:t>
+              <w:t xml:space="preserve">総再生 825.5万</w:t>
             </w:r>
           </w:p>
         </w:tc>
@@ -2116,7 +1955,7 @@
                 <w:sz w:val="19"/>
                 <w:szCs w:val="19"/>
               </w:rPr>
-              <w:t xml:space="preserve">Instagram</w:t>
+              <w:t xml:space="preserve">Spotify</w:t>
             </w:r>
           </w:p>
         </w:tc>
@@ -2140,7 +1979,7 @@
                 <w:sz w:val="19"/>
                 <w:szCs w:val="19"/>
               </w:rPr>
-              <w:t xml:space="preserve">@__saewool</w:t>
+              <w:t xml:space="preserve">Vivanz Eden</w:t>
             </w:r>
           </w:p>
         </w:tc>
@@ -2166,7 +2005,7 @@
                 <w:sz w:val="19"/>
                 <w:szCs w:val="19"/>
               </w:rPr>
-              <w:t xml:space="preserve">—</w:t>
+              <w:t xml:space="preserve">月間リスナー 14.0万</w:t>
             </w:r>
           </w:p>
         </w:tc>
@@ -2190,7 +2029,7 @@
                 <w:sz w:val="17"/>
                 <w:szCs w:val="17"/>
               </w:rPr>
-              <w:t xml:space="preserve">弾き語りリール中心</w:t>
+              <w:t xml:space="preserve">フォロワー 1.8万 / 葡萄 111万再生</w:t>
             </w:r>
           </w:p>
         </w:tc>
@@ -2218,7 +2057,7 @@
                 <w:sz w:val="19"/>
                 <w:szCs w:val="19"/>
               </w:rPr>
-              <w:t xml:space="preserve">X</w:t>
+              <w:t xml:space="preserve">Instagram</w:t>
             </w:r>
           </w:p>
         </w:tc>
@@ -2242,7 +2081,7 @@
                 <w:sz w:val="19"/>
                 <w:szCs w:val="19"/>
               </w:rPr>
-              <w:t xml:space="preserve">@sae_wool</w:t>
+              <w:t xml:space="preserve">@vivanzedenjp</w:t>
             </w:r>
           </w:p>
         </w:tc>
@@ -2292,7 +2131,7 @@
                 <w:sz w:val="17"/>
                 <w:szCs w:val="17"/>
               </w:rPr>
-              <w:t xml:space="preserve">告知用</w:t>
+              <w:t xml:space="preserve">レコーディング／ライブ告知</w:t>
             </w:r>
           </w:p>
         </w:tc>
@@ -2320,7 +2159,7 @@
                 <w:sz w:val="19"/>
                 <w:szCs w:val="19"/>
               </w:rPr>
-              <w:t xml:space="preserve">Spotify</w:t>
+              <w:t xml:space="preserve">X</w:t>
             </w:r>
           </w:p>
         </w:tc>
@@ -2344,7 +2183,7 @@
                 <w:sz w:val="19"/>
                 <w:szCs w:val="19"/>
               </w:rPr>
-              <w:t xml:space="preserve">saewool</w:t>
+              <w:t xml:space="preserve">@VivanzEden / @__ryomakikuchi</w:t>
             </w:r>
           </w:p>
         </w:tc>
@@ -2370,7 +2209,7 @@
                 <w:sz w:val="19"/>
                 <w:szCs w:val="19"/>
               </w:rPr>
-              <w:t xml:space="preserve">月間リスナー 4,347</w:t>
+              <w:t xml:space="preserve">—</w:t>
             </w:r>
           </w:p>
         </w:tc>
@@ -2394,7 +2233,7 @@
                 <w:sz w:val="17"/>
                 <w:szCs w:val="17"/>
               </w:rPr>
-              <w:t xml:space="preserve">フォロワー 596 / 「ボトルメール」22,237再生</w:t>
+              <w:t xml:space="preserve">菊地個人アカウントあり</w:t>
             </w:r>
           </w:p>
         </w:tc>
@@ -2444,7 +2283,7 @@
           <w:sz w:val="21"/>
           <w:szCs w:val="21"/>
         </w:rPr>
-        <w:t xml:space="preserve">アコースティックギター1本の弾き語り。加工を足さない生声＋生ギターで、原曲のテンポを落として「余白」で聴かせるアレンジが基本形。</w:t>
+        <w:t xml:space="preserve">ロック／ポップス／R&amp;B／ボカロを横断するジャンルレス。武器は菊地諒真の歌唱力（ミックスボイスを含む声域と音圧）で、バンドの編成よりも「声」が先に立つ構造。</w:t>
       </w:r>
     </w:p>
     <w:p>
@@ -2462,7 +2301,7 @@
           <w:sz w:val="21"/>
           <w:szCs w:val="21"/>
         </w:rPr>
-        <w:t xml:space="preserve">選曲はJ-POP／ボカロ／アニメ・ゲームIP曲が主軸。米津玄師「Lemon」「JANE DOE」、ヨルシカ「いさな」「ノーチラス」「花に亡霊」、ヒグチアイ「悪魔の子」、澤野弘之「Call of Silence」、RADWIMPS「Sparkle」、初音ミク「メルト」ほか。</w:t>
+        <w:t xml:space="preserve">リリースは 葡萄（2026/5/27・作詞作曲 菊地諒真／編曲 菊地諒真・福島章嗣）、春うらら、美学、マルベリー、ETA、透明（松浦航大とのコラボ）、ワインレッドナイト ほか。アルバム『offbase』『青果』（2024）。</w:t>
       </w:r>
     </w:p>
     <w:p>
@@ -2480,7 +2319,7 @@
           <w:sz w:val="21"/>
           <w:szCs w:val="21"/>
         </w:rPr>
-        <w:t xml:space="preserve">韓国語曲（최유리「숲」、한로로「입춘」）も同じ口調で歌える日韓バイリンガル。ハッシュタグも日/韓/英を併記しており、越境設計が最初から入っている。</w:t>
+        <w:t xml:space="preserve">DSP実績：葡萄 111万／ワインレッドナイト 41.6万／MULBERRY 23.1万／透明 14.8万／ETA 10.9万。YouTubeは 葡萄MV 84万／ワインレッドナイト 23万／マルベリー 17万／透明MV 15万。</w:t>
       </w:r>
     </w:p>
     <w:p>
@@ -2498,7 +2337,7 @@
           <w:sz w:val="21"/>
           <w:szCs w:val="21"/>
         </w:rPr>
-        <w:t xml:space="preserve">オリジナルはボカロP Aliey:S 提供の「ボトルメール」（saewoolがVocal＋イラスト＋MVを担当）、「あなたの海」、最新作「透過する夏」（2026年7月23日配信）。</w:t>
+        <w:t xml:space="preserve">菊地はTikTok LIVEで back number「助演女優症2」、藤井風「満ちてゆく」などを弾き語り。カバー時の反応が本人の楽曲と同等以上に取れており、“歌える人”としての支持が数字で見えている。</w:t>
       </w:r>
     </w:p>
     <w:p>
@@ -2534,15 +2373,15 @@
           <w:sz w:val="21"/>
           <w:szCs w:val="21"/>
         </w:rPr>
-        <w:t xml:space="preserve">「保存される」歌声　</w:t>
-      </w:r>
-      <w:r>
-        <w:rPr>
-          <w:color w:val="1A1A1A"/>
-          <w:sz w:val="21"/>
-          <w:szCs w:val="21"/>
-        </w:rPr>
-        <w:t xml:space="preserve">「I Really Want to Stay at Your House」は140万再生／いいね23.9万／シェア2.63万／保存4.31万（ER 17.1%、保存率3.1%）。バズの数字ではなく“もう一度聴きたい”の数字が立っている＝DSPに移せるリスナー。</w:t>
+        <w:t xml:space="preserve">本命は菊地諒真のボーカル　</w:t>
+      </w:r>
+      <w:r>
+        <w:rPr>
+          <w:color w:val="1A1A1A"/>
+          <w:sz w:val="21"/>
+          <w:szCs w:val="21"/>
+        </w:rPr>
+        <w:t xml:space="preserve">1曲で100万再生を作り、弾き語りカバーでも同じだけ刺さる。バンドの機能というより「この声を聴きたい」で人が集まっている状態。back number 的な“国民的歌声”の枠に最も近い。</w:t>
       </w:r>
     </w:p>
     <w:p>
@@ -2562,15 +2401,15 @@
           <w:sz w:val="21"/>
           <w:szCs w:val="21"/>
         </w:rPr>
-        <w:t xml:space="preserve">100万再生のカバーが単発ではない　</w:t>
-      </w:r>
-      <w:r>
-        <w:rPr>
-          <w:color w:val="1A1A1A"/>
-          <w:sz w:val="21"/>
-          <w:szCs w:val="21"/>
-        </w:rPr>
-        <w:t xml:space="preserve">TikTok 230万／170万／140万、YouTube本編でも163万・148万・101万。当たりが再現している＝運ではなく歌と選曲の力。</w:t>
+        <w:t xml:space="preserve">作詞作曲が本人　</w:t>
+      </w:r>
+      <w:r>
+        <w:rPr>
+          <w:color w:val="1A1A1A"/>
+          <w:sz w:val="21"/>
+          <w:szCs w:val="21"/>
+        </w:rPr>
+        <w:t xml:space="preserve">全曲を菊地が書いている。声だけの人ではなく、曲を書ける人。制作コストが低く、リリースサイクルを我々が設計すればすぐ回せる。</w:t>
       </w:r>
     </w:p>
     <w:p>
@@ -2590,15 +2429,15 @@
           <w:sz w:val="21"/>
           <w:szCs w:val="21"/>
         </w:rPr>
-        <w:t xml:space="preserve">フルセルフプロデュース　</w:t>
-      </w:r>
-      <w:r>
-        <w:rPr>
-          <w:color w:val="1A1A1A"/>
-          <w:sz w:val="21"/>
-          <w:szCs w:val="21"/>
-        </w:rPr>
-        <w:t xml:space="preserve">ジャケット、イラスト、MVまで本人制作。世界観が既に統一されており、レーベルは“作り直す”のではなく“増幅する”だけで足りる。</w:t>
+        <w:t xml:space="preserve">「実需」がある　</w:t>
+      </w:r>
+      <w:r>
+        <w:rPr>
+          <w:color w:val="1A1A1A"/>
+          <w:sz w:val="21"/>
+          <w:szCs w:val="21"/>
+        </w:rPr>
+        <w:t xml:space="preserve">月間14万リスナー、初ワンマン東京・大阪 両公演SOLD OUT、追加公演発表。SNSの数字ではなくチケットと再生というお金の動く指標で実証済み。</w:t>
       </w:r>
     </w:p>
     <w:p>
@@ -2618,60 +2457,15 @@
           <w:sz w:val="21"/>
           <w:szCs w:val="21"/>
         </w:rPr>
-        <w:t xml:space="preserve">日韓＋アニメIPの三重の入口　</w:t>
-      </w:r>
-      <w:r>
-        <w:rPr>
-          <w:color w:val="1A1A1A"/>
-          <w:sz w:val="21"/>
-          <w:szCs w:val="21"/>
-        </w:rPr>
-        <w:t xml:space="preserve">韓国チャンネル／日本語楽曲／アニメ・ゲームIP曲という3方向のリーチを1人で持っている。K-POPでもJ-POPでもない“越境弾き語り”の枠がまだ空いている。</w:t>
-      </w:r>
-    </w:p>
-    <w:p>
-      <w:pPr>
-        <w:pStyle w:val="Heading2"/>
-        <w:spacing w:after="110" w:before="240"/>
-      </w:pPr>
-      <w:r>
-        <w:rPr>
-          <w:b/>
-          <w:bCs/>
-          <w:color w:val="1A1A1A"/>
-          <w:sz w:val="23"/>
-          <w:szCs w:val="23"/>
-        </w:rPr>
-        <w:t xml:space="preserve">いま起きている“詰まり”</w:t>
-      </w:r>
-    </w:p>
-    <w:p>
-      <w:pPr>
-        <w:spacing w:after="160" w:before="0"/>
-      </w:pPr>
-      <w:r>
-        <w:rPr>
-          <w:color w:val="1A1A1A"/>
-          <w:sz w:val="21"/>
-          <w:szCs w:val="21"/>
-        </w:rPr>
-        <w:t xml:space="preserve">SNSでは累計1,000万再生超のリーチを持ちながら、Spotify月間リスナーは4,347人・オリジナルMVは2万再生。カバーの巨大リーチが、オリジナルとDSPにまったく落ちていない。ここは本人では解けず、レーベルが入れば確実に動く領域。</w:t>
-      </w:r>
-    </w:p>
-    <w:p>
-      <w:pPr>
-        <w:pStyle w:val="Heading2"/>
-        <w:spacing w:after="110" w:before="240"/>
-      </w:pPr>
-      <w:r>
-        <w:rPr>
-          <w:b/>
-          <w:bCs/>
-          <w:color w:val="1A1A1A"/>
-          <w:sz w:val="23"/>
-          <w:szCs w:val="23"/>
-        </w:rPr>
-        <w:t xml:space="preserve">ヒットへの手がかり — レーベルは何をしたら売れるか</w:t>
+        <w:t xml:space="preserve">TikTokの当て方が上手い　</w:t>
+      </w:r>
+      <w:r>
+        <w:rPr>
+          <w:color w:val="1A1A1A"/>
+          <w:sz w:val="21"/>
+          <w:szCs w:val="21"/>
+        </w:rPr>
+        <w:t xml:space="preserve">「どこの歌詞が好き？」「この曲どう？」型の投げかけで、1曲を切り口を変えて何度も当てている（110万再生でER13.6%／保存2.9万／シェア1.34万）。運用ノウハウが既にある。</w:t>
       </w:r>
     </w:p>
     <w:p>
@@ -2691,15 +2485,60 @@
           <w:sz w:val="21"/>
           <w:szCs w:val="21"/>
         </w:rPr>
-        <w:t xml:space="preserve">1）カバーを「音源」にして導線を閉じる　</w:t>
-      </w:r>
-      <w:r>
-        <w:rPr>
-          <w:color w:val="1A1A1A"/>
-          <w:sz w:val="21"/>
-          <w:szCs w:val="21"/>
-        </w:rPr>
-        <w:t xml:space="preserve">公式カバーEP（許諾込み）を出し、バズ動画のキャプション／固定コメント／プロフィールリンクをDSPに一本化。バズ済みタイトル（Call of Silence／悪魔の子／JANE DOE）から着手すれば、需要はすでに実証済み。</w:t>
+        <w:t xml:space="preserve">外部評価の下地　</w:t>
+      </w:r>
+      <w:r>
+        <w:rPr>
+          <w:color w:val="1A1A1A"/>
+          <w:sz w:val="21"/>
+          <w:szCs w:val="21"/>
+        </w:rPr>
+        <w:t xml:space="preserve">ROJACK掲載、NACK5『ラジアナ』ゲスト、Podcast『Harbor Blue Studio』#186/#187 出演、松浦航大とのコラボ。“業界内で名前が回り始めている”段階。</w:t>
+      </w:r>
+    </w:p>
+    <w:p>
+      <w:pPr>
+        <w:pStyle w:val="Heading2"/>
+        <w:spacing w:after="110" w:before="240"/>
+      </w:pPr>
+      <w:r>
+        <w:rPr>
+          <w:b/>
+          <w:bCs/>
+          <w:color w:val="1A1A1A"/>
+          <w:sz w:val="23"/>
+          <w:szCs w:val="23"/>
+        </w:rPr>
+        <w:t xml:space="preserve">いま起きている“詰まり”</w:t>
+      </w:r>
+    </w:p>
+    <w:p>
+      <w:pPr>
+        <w:spacing w:after="160" w:before="0"/>
+      </w:pPr>
+      <w:r>
+        <w:rPr>
+          <w:color w:val="1A1A1A"/>
+          <w:sz w:val="21"/>
+          <w:szCs w:val="21"/>
+        </w:rPr>
+        <w:t xml:space="preserve">「葡萄」の一発は当たったが、それを連打に変える制作・流通体制がない。TikTok 11.98万に対しSpotify月間14万＝すでにSNS以上に音楽で聴かれている稀なタイプなのに、供給が追いついていない。バンドとしての機能が弱い分、菊地の声を主役に据えた座組の再設計が最短距離。</w:t>
+      </w:r>
+    </w:p>
+    <w:p>
+      <w:pPr>
+        <w:pStyle w:val="Heading2"/>
+        <w:spacing w:after="110" w:before="240"/>
+      </w:pPr>
+      <w:r>
+        <w:rPr>
+          <w:b/>
+          <w:bCs/>
+          <w:color w:val="1A1A1A"/>
+          <w:sz w:val="23"/>
+          <w:szCs w:val="23"/>
+        </w:rPr>
+        <w:t xml:space="preserve">ヒットへの手がかり — レーベルは何をしたら売れるか</w:t>
       </w:r>
     </w:p>
     <w:p>
@@ -2719,15 +2558,15 @@
           <w:sz w:val="21"/>
           <w:szCs w:val="21"/>
         </w:rPr>
-        <w:t xml:space="preserve">2）アニメ・ゲームIPタイアップを最優先で当てる　</w:t>
-      </w:r>
-      <w:r>
-        <w:rPr>
-          <w:color w:val="1A1A1A"/>
-          <w:sz w:val="21"/>
-          <w:szCs w:val="21"/>
-        </w:rPr>
-        <w:t xml:space="preserve">当たった3本すべてがIP曲（進撃の巨人／Cyberpunk／チェンソーマン）。相性は数字で証明済み。ED曲・キャラソン・ゲームOSTの弾き語り枠は競合が薄い。</w:t>
+        <w:t xml:space="preserve">1）菊地の声を主役に置いた制作体制に組み替える　</w:t>
+      </w:r>
+      <w:r>
+        <w:rPr>
+          <w:color w:val="1A1A1A"/>
+          <w:sz w:val="21"/>
+          <w:szCs w:val="21"/>
+        </w:rPr>
+        <w:t xml:space="preserve">バンド名は資産なので維持しつつ、制作は「菊地＝シンガーソングライター＋外部アレンジャー／スタジオミュージシャン」に切り替える。3ピースの演奏力に制約されず、声が最大化されるアレンジを付けられる。</w:t>
       </w:r>
     </w:p>
     <w:p>
@@ -2747,15 +2586,15 @@
           <w:sz w:val="21"/>
           <w:szCs w:val="21"/>
         </w:rPr>
-        <w:t xml:space="preserve">3）ボカロP×saewool のコライト体制を常設　</w:t>
-      </w:r>
-      <w:r>
-        <w:rPr>
-          <w:color w:val="1A1A1A"/>
-          <w:sz w:val="21"/>
-          <w:szCs w:val="21"/>
-        </w:rPr>
-        <w:t xml:space="preserve">「ボトルメール」で機能した Aliey:S 型の座組を月1本ペースに。米津／ヨルシカ／ロクデナシ経由でボカロ文脈から表に出る導線は、日本のリスナー側が既に慣れている。</w:t>
+        <w:t xml:space="preserve">2）「葡萄」の当たりを曲の連打に変える　</w:t>
+      </w:r>
+      <w:r>
+        <w:rPr>
+          <w:color w:val="1A1A1A"/>
+          <w:sz w:val="21"/>
+          <w:szCs w:val="21"/>
+        </w:rPr>
+        <w:t xml:space="preserve">月間14万リスナーが乗っている今、3ヶ月に1曲では足りない。プリプロを外に出して6〜8週間に1曲のサイクルへ。すでに「Always」制作中との発信もあり、タイミングは今。</w:t>
       </w:r>
     </w:p>
     <w:p>
@@ -2775,15 +2614,15 @@
           <w:sz w:val="21"/>
           <w:szCs w:val="21"/>
         </w:rPr>
-        <w:t xml:space="preserve">4）日韓同時展開　</w:t>
-      </w:r>
-      <w:r>
-        <w:rPr>
-          <w:color w:val="1A1A1A"/>
-          <w:sz w:val="21"/>
-          <w:szCs w:val="21"/>
-        </w:rPr>
-        <w:t xml:space="preserve">韓国側のチャンネル資産と韓国語カバーがすでにある。日本盤リリースと同時に韓国プレイリスト／韓国語版を出せば、1曲で2市場を取れる。</w:t>
+        <w:t xml:space="preserve">3）弾き語りカバー資産を正面から商品化　</w:t>
+      </w:r>
+      <w:r>
+        <w:rPr>
+          <w:color w:val="1A1A1A"/>
+          <w:sz w:val="21"/>
+          <w:szCs w:val="21"/>
+        </w:rPr>
+        <w:t xml:space="preserve">back number／藤井風のカバーが刺さっている。カバー配信EPかライブ盤（許諾込み）で、“歌がうまい人”としての一般認知を先に取る。オリジナルより早く広い層に届く。</w:t>
       </w:r>
     </w:p>
     <w:p>
@@ -2803,31 +2642,15 @@
           <w:sz w:val="21"/>
           <w:szCs w:val="21"/>
         </w:rPr>
-        <w:t xml:space="preserve">5）“顔と場所”をつくる　</w:t>
-      </w:r>
-      <w:r>
-        <w:rPr>
-          <w:color w:val="1A1A1A"/>
-          <w:sz w:val="21"/>
-          <w:szCs w:val="21"/>
-        </w:rPr>
-        <w:t xml:space="preserve">現状は手元と声中心。アーティスト写真・縦型ライブ映像・小規模ワンマンを用意して、リスナーが応援対象として認識できる像を早期に立てる。</w:t>
-      </w:r>
-    </w:p>
-    <w:p>
-      <w:pPr>
-        <w:pStyle w:val="Heading2"/>
-        <w:spacing w:after="110" w:before="240"/>
-      </w:pPr>
-      <w:r>
-        <w:rPr>
-          <w:b/>
-          <w:bCs/>
-          <w:color w:val="1A1A1A"/>
-          <w:sz w:val="23"/>
-          <w:szCs w:val="23"/>
-        </w:rPr>
-        <w:t xml:space="preserve">おすすめ参考動画</w:t>
+        <w:t xml:space="preserve">4）ライブが売れる強みでP/Lを先に立てる　</w:t>
+      </w:r>
+      <w:r>
+        <w:rPr>
+          <w:color w:val="1A1A1A"/>
+          <w:sz w:val="21"/>
+          <w:szCs w:val="21"/>
+        </w:rPr>
+        <w:t xml:space="preserve">初ワンマンで東名阪級が完売する動員力。ツアー規模拡大＋物販設計で、音源が育つ前にキャッシュを回せる。契約条件の説明もしやすい。</w:t>
       </w:r>
     </w:p>
     <w:p>
@@ -2841,11 +2664,55 @@
       </w:pPr>
       <w:r>
         <w:rPr>
-          <w:color w:val="1A1A1A"/>
-          <w:sz w:val="21"/>
-          <w:szCs w:val="21"/>
-        </w:rPr>
-        <w:t xml:space="preserve">【本命】I Really Want to Stay at Your House（TikTok・140万再生／ER 17.1%・保存4.3万）</w:t>
+          <w:b/>
+          <w:bCs/>
+          <w:color w:val="1A1A1A"/>
+          <w:sz w:val="21"/>
+          <w:szCs w:val="21"/>
+        </w:rPr>
+        <w:t xml:space="preserve">5）タイアップは“声質”で取りにいく　</w:t>
+      </w:r>
+      <w:r>
+        <w:rPr>
+          <w:color w:val="1A1A1A"/>
+          <w:sz w:val="21"/>
+          <w:szCs w:val="21"/>
+        </w:rPr>
+        <w:t xml:space="preserve">ドラマ・アニメの主題歌枠は歌声の説得力で決まる。葡萄／透明の音源をそのまま提案材料にできる完成度がある。</w:t>
+      </w:r>
+    </w:p>
+    <w:p>
+      <w:pPr>
+        <w:pStyle w:val="Heading2"/>
+        <w:spacing w:after="110" w:before="240"/>
+      </w:pPr>
+      <w:r>
+        <w:rPr>
+          <w:b/>
+          <w:bCs/>
+          <w:color w:val="1A1A1A"/>
+          <w:sz w:val="23"/>
+          <w:szCs w:val="23"/>
+        </w:rPr>
+        <w:t xml:space="preserve">おすすめ参考動画</w:t>
+      </w:r>
+    </w:p>
+    <w:p>
+      <w:pPr>
+        <w:pStyle w:val="ListParagraph"/>
+        <w:numPr>
+          <w:ilvl w:val="0"/>
+          <w:numId w:val="2"/>
+        </w:numPr>
+        <w:spacing w:after="110"/>
+      </w:pPr>
+      <w:r>
+        <w:rPr>
+          <w:color w:val="1A1A1A"/>
+          <w:sz w:val="21"/>
+          <w:szCs w:val="21"/>
+        </w:rPr>
+        <w:t xml:space="preserve">【本命】Vivanz Eden「葡萄」Music Video（YouTube・84万再生）</w:t>
       </w:r>
       <w:r>
         <w:rPr>
@@ -2854,7 +2721,7 @@
         </w:rPr>
         <w:t xml:space="preserve">　</w:t>
       </w:r>
-      <w:hyperlink w:history="1" r:id="rIdkoq56iwhofbda23fitayr">
+      <w:hyperlink w:history="1" r:id="rIdu1tvvjbqjrjioqnjzslfb">
         <w:r>
           <w:rPr>
             <w:color w:val="1155CC"/>
@@ -2862,7 +2729,7 @@
             <w:szCs w:val="19"/>
             <w:u w:val="single"/>
           </w:rPr>
-          <w:t xml:space="preserve">https://www.tiktok.com/@saewool/video/7594430675424447762</w:t>
+          <w:t xml:space="preserve">https://www.youtube.com/watch?v=eAstqpJPMgA</w:t>
         </w:r>
       </w:hyperlink>
       <w:r>
@@ -2873,7 +2740,7 @@
           <w:sz w:val="19"/>
           <w:szCs w:val="19"/>
         </w:rPr>
-        <w:t xml:space="preserve">　→ 数字が一番きれいな1本。保存とシェアの比率をこの場で見てほしい。</w:t>
+        <w:t xml:space="preserve">　→ 代表曲。まずこれで声を聴かせる。</w:t>
       </w:r>
     </w:p>
     <w:p>
@@ -2891,7 +2758,7 @@
           <w:sz w:val="21"/>
           <w:szCs w:val="21"/>
         </w:rPr>
-        <w:t xml:space="preserve">「JANE DOE」acoustic cover（YouTube・163万再生）</w:t>
+        <w:t xml:space="preserve">「葡萄」TikTokクリップ（110万再生／ER13.6%／保存2.9万）</w:t>
       </w:r>
       <w:r>
         <w:rPr>
@@ -2900,7 +2767,7 @@
         </w:rPr>
         <w:t xml:space="preserve">　</w:t>
       </w:r>
-      <w:hyperlink w:history="1" r:id="rIdnrswct4_jgaiuubmd8zvs">
+      <w:hyperlink w:history="1" r:id="rIdp_nneelon_dtpuirpxoap">
         <w:r>
           <w:rPr>
             <w:color w:val="1155CC"/>
@@ -2908,7 +2775,7 @@
             <w:szCs w:val="19"/>
             <w:u w:val="single"/>
           </w:rPr>
-          <w:t xml:space="preserve">https://www.youtube.com/watch?v=etd5Q5Yq8RI</w:t>
+          <w:t xml:space="preserve">https://www.tiktok.com/@vivanzeden_jp/video/7652617742779976981</w:t>
         </w:r>
       </w:hyperlink>
       <w:r>
@@ -2919,7 +2786,7 @@
           <w:sz w:val="19"/>
           <w:szCs w:val="19"/>
         </w:rPr>
-        <w:t xml:space="preserve">　→ 本編尺でも持つ歌唱力。ショートだけの人ではない証明。</w:t>
+        <w:t xml:space="preserve">　→ 1曲を切り口を変えて何度も当てる運用力。</w:t>
       </w:r>
     </w:p>
     <w:p>
@@ -2937,7 +2804,7 @@
           <w:sz w:val="21"/>
           <w:szCs w:val="21"/>
         </w:rPr>
-        <w:t xml:space="preserve">Call of Silence（TikTok・230万再生／保存3.5万）</w:t>
+        <w:t xml:space="preserve">菊地諒真 弾き語り／back number「助演女優症2」（TikTok切り抜き）</w:t>
       </w:r>
       <w:r>
         <w:rPr>
@@ -2946,7 +2813,7 @@
         </w:rPr>
         <w:t xml:space="preserve">　</w:t>
       </w:r>
-      <w:hyperlink w:history="1" r:id="rIdxrjqd_8nkypto49o8y_bq">
+      <w:hyperlink w:history="1" r:id="rIdho_1wv0rwh1fqqgbm6j9e">
         <w:r>
           <w:rPr>
             <w:color w:val="1155CC"/>
@@ -2954,7 +2821,7 @@
             <w:szCs w:val="19"/>
             <w:u w:val="single"/>
           </w:rPr>
-          <w:t xml:space="preserve">https://www.tiktok.com/@saewool/video/7480508799699160338</w:t>
+          <w:t xml:space="preserve">https://www.tiktok.com/@shogohamada1229/video/7506809303290940690</w:t>
         </w:r>
       </w:hyperlink>
       <w:r>
@@ -2965,7 +2832,7 @@
           <w:sz w:val="19"/>
           <w:szCs w:val="19"/>
         </w:rPr>
-        <w:t xml:space="preserve">　→ 最大バズ。アニメIPとの相性。</w:t>
+        <w:t xml:space="preserve">　→ 「次のback number枠」という提案の根拠。声一本での説得力を見せる。</w:t>
       </w:r>
     </w:p>
     <w:p>
@@ -2983,7 +2850,7 @@
           <w:sz w:val="21"/>
           <w:szCs w:val="21"/>
         </w:rPr>
-        <w:t xml:space="preserve">「ボトルメール」Music Video（YouTube・オリジナル）</w:t>
+        <w:t xml:space="preserve">Vivanz Eden「透明」Music Video（松浦航大コラボ・15万再生）</w:t>
       </w:r>
       <w:r>
         <w:rPr>
@@ -2992,7 +2859,7 @@
         </w:rPr>
         <w:t xml:space="preserve">　</w:t>
       </w:r>
-      <w:hyperlink w:history="1" r:id="rIdwbwwpn8j8ux76vrixoq_b">
+      <w:hyperlink w:history="1" r:id="rIda6rla8fymiuhktkb-abat">
         <w:r>
           <w:rPr>
             <w:color w:val="1155CC"/>
@@ -3000,7 +2867,7 @@
             <w:szCs w:val="19"/>
             <w:u w:val="single"/>
           </w:rPr>
-          <w:t xml:space="preserve">https://www.youtube.com/watch?v=_phxFISB41M</w:t>
+          <w:t xml:space="preserve">https://www.youtube.com/watch?v=doS0m4KjHQU</w:t>
         </w:r>
       </w:hyperlink>
       <w:r>
@@ -3011,7 +2878,7 @@
           <w:sz w:val="19"/>
           <w:szCs w:val="19"/>
         </w:rPr>
-        <w:t xml:space="preserve">　→ オリジナルは2万再生。ここが我々の仕事の余地。</w:t>
+        <w:t xml:space="preserve">　→ 歌い手／ボーカリスト文脈での評価。外部との噛み合わせ。</w:t>
       </w:r>
     </w:p>
     <w:p>
@@ -3040,7 +2907,7 @@
           <w:sz w:val="21"/>
           <w:szCs w:val="21"/>
         </w:rPr>
-        <w:t xml:space="preserve">本人が韓国在住のため、契約・活動体制は韓国側のスキームを含めた確認が必要。オリジナル「ボトルメール」は他者（Aliey:S）作曲＝原盤／出版の整理を先に。</w:t>
+        <w:t xml:space="preserve">前回（2025/7/22）当部門から提出済み案件のため、今回は「菊地のボーカル軸」という切り口の違いを明確にする必要あり。バンド内の合意形成（座組変更を受け入れられるか）と、8月ワンマン後の他社接触リスクが論点。</w:t>
       </w:r>
     </w:p>
     <w:p>
@@ -3181,7 +3048,7 @@
                 <w:sz w:val="19"/>
                 <w:szCs w:val="19"/>
               </w:rPr>
-              <w:t xml:space="preserve">キャッチコピー「再生されるより、「保存」される声。」から入る。韓国発・日本語で刺す弾き語り。2.3M再生の裏に、保存3.5万。</w:t>
+              <w:t xml:space="preserve">キャッチコピー「「葡萄」で証明済み。次のback numberは、この声から。」から入る。Spotify月間14万リスナー／初ワンマン東名阪SOLD OUT／全曲 菊地諒真 作詞作曲。</w:t>
             </w:r>
           </w:p>
         </w:tc>
@@ -3233,7 +3100,7 @@
                 <w:sz w:val="19"/>
                 <w:szCs w:val="19"/>
               </w:rPr>
-              <w:t xml:space="preserve">何者か＋主要指標4つ（8.45万=TikTokフォロワー / 230万=最大再生（1本） / 4,347=Spotify月間リスナー / 3.1%=保存率（1.4M再生／4.3万保存））</w:t>
+              <w:t xml:space="preserve">何者か＋主要指標4つ（14.0万=Spotify月間リスナー / 111万=「葡萄」Spotify再生 / SOLD OUT=初ワンマン 東京・大阪 両公演 / 130万=TikTok最大再生（葡萄クリップ））</w:t>
             </w:r>
           </w:p>
         </w:tc>
@@ -3285,7 +3152,7 @@
                 <w:sz w:val="19"/>
                 <w:szCs w:val="19"/>
               </w:rPr>
-              <w:t xml:space="preserve">参考動画①を再生：【本命】I Really Want to Stay at Your House（TikTok・140万再生／ER 17.1%・保存4.3万）</w:t>
+              <w:t xml:space="preserve">参考動画①を再生：【本命】Vivanz Eden「葡萄」Music Video（YouTube・84万再生）</w:t>
             </w:r>
           </w:p>
         </w:tc>
@@ -3337,7 +3204,7 @@
                 <w:sz w:val="19"/>
                 <w:szCs w:val="19"/>
               </w:rPr>
-              <w:t xml:space="preserve">魅力の1点目と2点目に絞って話す：「保存される」歌声 ／ 100万再生のカバーが単発ではない</w:t>
+              <w:t xml:space="preserve">魅力の1点目と2点目に絞って話す：本命は菊地諒真のボーカル ／ 作詞作曲が本人</w:t>
             </w:r>
           </w:p>
         </w:tc>
@@ -3389,7 +3256,7 @@
                 <w:sz w:val="19"/>
                 <w:szCs w:val="19"/>
               </w:rPr>
-              <w:t xml:space="preserve">詰まりと打ち手：いま起きている“詰まり” → カバーを「音源」にして導線を閉じる ／ アニメ・ゲームIPタイアップを最優先で当てる</w:t>
+              <w:t xml:space="preserve">詰まりと打ち手：いま起きている“詰まり” → 菊地の声を主役に置いた制作体制に組み替える ／ 「葡萄」の当たりを曲の連打に変える</w:t>
             </w:r>
           </w:p>
         </w:tc>
@@ -3441,7 +3308,7 @@
                 <w:sz w:val="19"/>
                 <w:szCs w:val="19"/>
               </w:rPr>
-              <w:t xml:space="preserve">アスク：アニメ／ゲームIPタイアップの枠出しと、公式カバーEPの許諾可否を確認したい。韓国在住のため契約スキームの相談も。</w:t>
+              <w:t xml:space="preserve">アスク：8月ワンマン（8/15大阪・8/28東京）に同行して現場確認したい。前回提出案件のため、菊地個人軸での再提案として扱いたい。</w:t>
             </w:r>
           </w:p>
         </w:tc>
@@ -4749,7 +4616,7 @@
           <w:sz w:val="21"/>
           <w:szCs w:val="21"/>
         </w:rPr>
-        <w:t xml:space="preserve">iCON Z 2次審査通過という下地がある。ボイストレーニングを入れて、パフォーマンス主導型のソロ、または後述 yuuna を含むユニットとして設計する。</w:t>
+        <w:t xml:space="preserve">iCON Z 2次審査通過という下地がある。ボイストレーニングを入れて、パフォーマンス主導型のソロ、または次にご紹介する yuuna を含むユニットとして設計する。</w:t>
       </w:r>
     </w:p>
     <w:p>
@@ -4876,7 +4743,7 @@
         </w:rPr>
         <w:t xml:space="preserve">　</w:t>
       </w:r>
-      <w:hyperlink w:history="1" r:id="rIdkqqeskgow7u6nkcsl1pz_">
+      <w:hyperlink w:history="1" r:id="rIdfmwhkmacana7kehxcl2wn">
         <w:r>
           <w:rPr>
             <w:color w:val="1155CC"/>
@@ -4922,7 +4789,7 @@
         </w:rPr>
         <w:t xml:space="preserve">　</w:t>
       </w:r>
-      <w:hyperlink w:history="1" r:id="rIdk9hasxno0m8c4zcjptkf_">
+      <w:hyperlink w:history="1" r:id="rIdpaqcjfuubifrfl7lggorm">
         <w:r>
           <w:rPr>
             <w:color w:val="1155CC"/>
@@ -4968,7 +4835,7 @@
         </w:rPr>
         <w:t xml:space="preserve">　</w:t>
       </w:r>
-      <w:hyperlink w:history="1" r:id="rIdsdreekr5gy49beb_blkn0">
+      <w:hyperlink w:history="1" r:id="rIda60c9ieut9uw0kq50qmuv">
         <w:r>
           <w:rPr>
             <w:color w:val="1155CC"/>
@@ -5014,7 +4881,7 @@
         </w:rPr>
         <w:t xml:space="preserve">　</w:t>
       </w:r>
-      <w:hyperlink w:history="1" r:id="rIdonaaec3sl2yfrpgrkelme">
+      <w:hyperlink w:history="1" r:id="rIdspdgdnge2batve3r0_udu">
         <w:r>
           <w:rPr>
             <w:color w:val="1155CC"/>
@@ -6832,7 +6699,7 @@
         </w:rPr>
         <w:t xml:space="preserve">　</w:t>
       </w:r>
-      <w:hyperlink w:history="1" r:id="rIdxuvqq1s9ns-aq6jthqoit">
+      <w:hyperlink w:history="1" r:id="rIdytle3b9p26kpn2gdld_3q">
         <w:r>
           <w:rPr>
             <w:color w:val="1155CC"/>
@@ -6878,7 +6745,7 @@
         </w:rPr>
         <w:t xml:space="preserve">　</w:t>
       </w:r>
-      <w:hyperlink w:history="1" r:id="rIdqc5nfozj2kl-qabzrczuh">
+      <w:hyperlink w:history="1" r:id="rIdn9yzikn8lf5etcslj4zqd">
         <w:r>
           <w:rPr>
             <w:color w:val="1155CC"/>
@@ -6924,7 +6791,7 @@
         </w:rPr>
         <w:t xml:space="preserve">　</w:t>
       </w:r>
-      <w:hyperlink w:history="1" r:id="rIdkjmv-rqngbv8uhfpeazjw">
+      <w:hyperlink w:history="1" r:id="rIddv20ijw7-rlfatkxz7asc">
         <w:r>
           <w:rPr>
             <w:color w:val="1155CC"/>
@@ -6970,7 +6837,7 @@
         </w:rPr>
         <w:t xml:space="preserve">　</w:t>
       </w:r>
-      <w:hyperlink w:history="1" r:id="rIdp-ogpvrvda4b63f4yup5_">
+      <w:hyperlink w:history="1" r:id="rIdl1bp639zdsnpnivtfq-nm">
         <w:r>
           <w:rPr>
             <w:color w:val="1155CC"/>
@@ -7443,2172 +7310,7 @@
           <w:sz w:val="30"/>
           <w:szCs w:val="30"/>
         </w:rPr>
-        <w:t xml:space="preserve">4. Vivanz Eden　（ヴィバンズエデン ／ Vo・Gt 菊地諒真）</w:t>
-      </w:r>
-    </w:p>
-    <w:p>
-      <w:pPr>
-        <w:spacing w:after="160" w:before="0"/>
-      </w:pPr>
-      <w:r>
-        <w:rPr>
-          <w:b/>
-          <w:bCs/>
-          <w:color w:val="5F6368"/>
-          <w:sz w:val="20"/>
-          <w:szCs w:val="20"/>
-        </w:rPr>
-        <w:t xml:space="preserve">3ピースバンド／本命は菊地のボーカル</w:t>
-      </w:r>
-      <w:r>
-        <w:rPr>
-          <w:color w:val="D6D8DC"/>
-          <w:sz w:val="21"/>
-          <w:szCs w:val="21"/>
-        </w:rPr>
-        <w:t xml:space="preserve">　｜　</w:t>
-      </w:r>
-      <w:r>
-        <w:rPr>
-          <w:color w:val="5F6368"/>
-          <w:sz w:val="20"/>
-          <w:szCs w:val="20"/>
-        </w:rPr>
-        <w:t xml:space="preserve">インディペンデント（レーベル未所属／自主流通・ライブは自力で完売）</w:t>
-      </w:r>
-    </w:p>
-    <w:tbl>
-      <w:tblPr>
-        <w:tblW w:type="dxa" w:w="9700"/>
-        <w:tblBorders>
-          <w:top w:val="single" w:color="D6D8DC" w:sz="4"/>
-          <w:left w:val="single" w:color="D6D8DC" w:sz="4"/>
-          <w:bottom w:val="single" w:color="D6D8DC" w:sz="4"/>
-          <w:right w:val="single" w:color="D6D8DC" w:sz="4"/>
-          <w:insideH w:val="single" w:color="D6D8DC" w:sz="4"/>
-          <w:insideV w:val="single" w:color="D6D8DC" w:sz="4"/>
-        </w:tblBorders>
-      </w:tblPr>
-      <w:tblGrid>
-        <w:gridCol w:w="9700"/>
-      </w:tblGrid>
-      <w:tr>
-        <w:tc>
-          <w:tcPr>
-            <w:tcW w:type="dxa" w:w="9700"/>
-            <w:shd w:fill="F1F3F5" w:color="auto" w:val="clear"/>
-            <w:tcMar>
-              <w:top w:type="dxa" w:w="140"/>
-              <w:left w:type="dxa" w:w="160"/>
-              <w:bottom w:type="dxa" w:w="140"/>
-              <w:right w:type="dxa" w:w="160"/>
-            </w:tcMar>
-          </w:tcPr>
-          <w:p>
-            <w:pPr>
-              <w:spacing w:after="60"/>
-            </w:pPr>
-            <w:r>
-              <w:rPr>
-                <w:b/>
-                <w:bCs/>
-                <w:color w:val="5F6368"/>
-                <w:sz w:val="17"/>
-                <w:szCs w:val="17"/>
-              </w:rPr>
-              <w:t xml:space="preserve">キャッチコピー</w:t>
-            </w:r>
-          </w:p>
-          <w:p>
-            <w:pPr>
-              <w:spacing w:after="60"/>
-            </w:pPr>
-            <w:r>
-              <w:rPr>
-                <w:b/>
-                <w:bCs/>
-                <w:color w:val="1A1A1A"/>
-                <w:sz w:val="28"/>
-                <w:szCs w:val="28"/>
-              </w:rPr>
-              <w:t xml:space="preserve">「「葡萄」で証明済み。次のback numberは、この声から。」</w:t>
-            </w:r>
-          </w:p>
-          <w:p>
-            <w:pPr>
-              <w:spacing w:after="0"/>
-            </w:pPr>
-            <w:r>
-              <w:rPr>
-                <w:color w:val="5F6368"/>
-                <w:sz w:val="19"/>
-                <w:szCs w:val="19"/>
-              </w:rPr>
-              <w:t xml:space="preserve">Spotify月間14万リスナー／初ワンマン東名阪SOLD OUT／全曲 菊地諒真 作詞作曲。</w:t>
-            </w:r>
-          </w:p>
-        </w:tc>
-      </w:tr>
-    </w:tbl>
-    <w:p>
-      <w:pPr>
-        <w:spacing w:after="140" w:before="0"/>
-      </w:pPr>
-      <w:r>
-        <w:rPr>
-          <w:color w:val="1A1A1A"/>
-          <w:sz w:val="21"/>
-          <w:szCs w:val="21"/>
-        </w:rPr>
-        <w:t xml:space="preserve"/>
-      </w:r>
-    </w:p>
-    <w:p>
-      <w:pPr>
-        <w:spacing w:after="160" w:before="0"/>
-      </w:pPr>
-      <w:r>
-        <w:rPr>
-          <w:color w:val="B3261E"/>
-          <w:sz w:val="19"/>
-          <w:szCs w:val="19"/>
-        </w:rPr>
-        <w:t xml:space="preserve">※ 正式表記は「菊地諒真」（“菊池涼馬”ではありません）。前回2025/7/22の新人プレゼンで当部門から提出済み → 今回は「バンド」ではなく「菊地のボーカル」を軸に再提案。</w:t>
-      </w:r>
-    </w:p>
-    <w:p>
-      <w:pPr>
-        <w:pStyle w:val="Heading2"/>
-        <w:spacing w:after="110" w:before="240"/>
-      </w:pPr>
-      <w:r>
-        <w:rPr>
-          <w:b/>
-          <w:bCs/>
-          <w:color w:val="1A1A1A"/>
-          <w:sz w:val="23"/>
-          <w:szCs w:val="23"/>
-        </w:rPr>
-        <w:t xml:space="preserve">どんなアーティストか</w:t>
-      </w:r>
-    </w:p>
-    <w:p>
-      <w:pPr>
-        <w:spacing w:after="160" w:before="0"/>
-      </w:pPr>
-      <w:r>
-        <w:rPr>
-          <w:color w:val="1A1A1A"/>
-          <w:sz w:val="21"/>
-          <w:szCs w:val="21"/>
-        </w:rPr>
-        <w:t xml:space="preserve">2024年1月始動の3ピース。菊地諒真（Vo/Gt）、Kaoru（Ba）、湊大輝（Dr）。「葡萄」がSpotify111万再生を突破し月間リスナー14万、初ワンマンツアー『only blue』（8/15大阪・8/28東京）は両公演SOLD OUT。楽曲は全て菊地の作詞作曲。ROJACK掲載時のコピーは「圧倒的歌唱力で魅せる、カオスなスリーピースバンド」。</w:t>
-      </w:r>
-    </w:p>
-    <w:p>
-      <w:pPr>
-        <w:pStyle w:val="Heading2"/>
-        <w:spacing w:after="110" w:before="240"/>
-      </w:pPr>
-      <w:r>
-        <w:rPr>
-          <w:b/>
-          <w:bCs/>
-          <w:color w:val="1A1A1A"/>
-          <w:sz w:val="23"/>
-          <w:szCs w:val="23"/>
-        </w:rPr>
-        <w:t xml:space="preserve">主要指標</w:t>
-      </w:r>
-    </w:p>
-    <w:tbl>
-      <w:tblPr>
-        <w:tblW w:type="dxa" w:w="9700"/>
-        <w:tblBorders>
-          <w:top w:val="single" w:color="D6D8DC" w:sz="4"/>
-          <w:left w:val="single" w:color="D6D8DC" w:sz="4"/>
-          <w:bottom w:val="single" w:color="D6D8DC" w:sz="4"/>
-          <w:right w:val="single" w:color="D6D8DC" w:sz="4"/>
-          <w:insideH w:val="single" w:color="D6D8DC" w:sz="4"/>
-          <w:insideV w:val="single" w:color="D6D8DC" w:sz="4"/>
-        </w:tblBorders>
-      </w:tblPr>
-      <w:tblGrid>
-        <w:gridCol w:w="2425"/>
-        <w:gridCol w:w="2425"/>
-        <w:gridCol w:w="2425"/>
-        <w:gridCol w:w="2425"/>
-      </w:tblGrid>
-      <w:tr>
-        <w:tc>
-          <w:tcPr>
-            <w:tcW w:type="dxa" w:w="2425"/>
-            <w:tcMar>
-              <w:top w:type="dxa" w:w="70"/>
-              <w:left w:type="dxa" w:w="110"/>
-              <w:bottom w:type="dxa" w:w="70"/>
-              <w:right w:type="dxa" w:w="110"/>
-            </w:tcMar>
-          </w:tcPr>
-          <w:p>
-            <w:pPr>
-              <w:spacing w:after="0"/>
-            </w:pPr>
-            <w:r>
-              <w:rPr>
-                <w:b/>
-                <w:bCs/>
-                <w:color w:val="1A1A1A"/>
-                <w:sz w:val="30"/>
-                <w:szCs w:val="30"/>
-              </w:rPr>
-              <w:t xml:space="preserve">14.0万</w:t>
-            </w:r>
-          </w:p>
-        </w:tc>
-        <w:tc>
-          <w:tcPr>
-            <w:tcW w:type="dxa" w:w="2425"/>
-            <w:tcMar>
-              <w:top w:type="dxa" w:w="70"/>
-              <w:left w:type="dxa" w:w="110"/>
-              <w:bottom w:type="dxa" w:w="70"/>
-              <w:right w:type="dxa" w:w="110"/>
-            </w:tcMar>
-          </w:tcPr>
-          <w:p>
-            <w:pPr>
-              <w:spacing w:after="0"/>
-            </w:pPr>
-            <w:r>
-              <w:rPr>
-                <w:b/>
-                <w:bCs/>
-                <w:color w:val="1A1A1A"/>
-                <w:sz w:val="30"/>
-                <w:szCs w:val="30"/>
-              </w:rPr>
-              <w:t xml:space="preserve">111万</w:t>
-            </w:r>
-          </w:p>
-        </w:tc>
-        <w:tc>
-          <w:tcPr>
-            <w:tcW w:type="dxa" w:w="2425"/>
-            <w:tcMar>
-              <w:top w:type="dxa" w:w="70"/>
-              <w:left w:type="dxa" w:w="110"/>
-              <w:bottom w:type="dxa" w:w="70"/>
-              <w:right w:type="dxa" w:w="110"/>
-            </w:tcMar>
-          </w:tcPr>
-          <w:p>
-            <w:pPr>
-              <w:spacing w:after="0"/>
-            </w:pPr>
-            <w:r>
-              <w:rPr>
-                <w:b/>
-                <w:bCs/>
-                <w:color w:val="1A1A1A"/>
-                <w:sz w:val="30"/>
-                <w:szCs w:val="30"/>
-              </w:rPr>
-              <w:t xml:space="preserve">SOLD OUT</w:t>
-            </w:r>
-          </w:p>
-        </w:tc>
-        <w:tc>
-          <w:tcPr>
-            <w:tcW w:type="dxa" w:w="2425"/>
-            <w:tcMar>
-              <w:top w:type="dxa" w:w="70"/>
-              <w:left w:type="dxa" w:w="110"/>
-              <w:bottom w:type="dxa" w:w="70"/>
-              <w:right w:type="dxa" w:w="110"/>
-            </w:tcMar>
-          </w:tcPr>
-          <w:p>
-            <w:pPr>
-              <w:spacing w:after="0"/>
-            </w:pPr>
-            <w:r>
-              <w:rPr>
-                <w:b/>
-                <w:bCs/>
-                <w:color w:val="1A1A1A"/>
-                <w:sz w:val="30"/>
-                <w:szCs w:val="30"/>
-              </w:rPr>
-              <w:t xml:space="preserve">130万</w:t>
-            </w:r>
-          </w:p>
-        </w:tc>
-      </w:tr>
-      <w:tr>
-        <w:tc>
-          <w:tcPr>
-            <w:tcW w:type="dxa" w:w="2425"/>
-            <w:tcMar>
-              <w:top w:type="dxa" w:w="70"/>
-              <w:left w:type="dxa" w:w="110"/>
-              <w:bottom w:type="dxa" w:w="70"/>
-              <w:right w:type="dxa" w:w="110"/>
-            </w:tcMar>
-          </w:tcPr>
-          <w:p>
-            <w:pPr>
-              <w:spacing w:after="0"/>
-            </w:pPr>
-            <w:r>
-              <w:rPr>
-                <w:color w:val="5F6368"/>
-                <w:sz w:val="17"/>
-                <w:szCs w:val="17"/>
-              </w:rPr>
-              <w:t xml:space="preserve">Spotify月間リスナー</w:t>
-            </w:r>
-          </w:p>
-        </w:tc>
-        <w:tc>
-          <w:tcPr>
-            <w:tcW w:type="dxa" w:w="2425"/>
-            <w:tcMar>
-              <w:top w:type="dxa" w:w="70"/>
-              <w:left w:type="dxa" w:w="110"/>
-              <w:bottom w:type="dxa" w:w="70"/>
-              <w:right w:type="dxa" w:w="110"/>
-            </w:tcMar>
-          </w:tcPr>
-          <w:p>
-            <w:pPr>
-              <w:spacing w:after="0"/>
-            </w:pPr>
-            <w:r>
-              <w:rPr>
-                <w:color w:val="5F6368"/>
-                <w:sz w:val="17"/>
-                <w:szCs w:val="17"/>
-              </w:rPr>
-              <w:t xml:space="preserve">「葡萄」Spotify再生</w:t>
-            </w:r>
-          </w:p>
-        </w:tc>
-        <w:tc>
-          <w:tcPr>
-            <w:tcW w:type="dxa" w:w="2425"/>
-            <w:tcMar>
-              <w:top w:type="dxa" w:w="70"/>
-              <w:left w:type="dxa" w:w="110"/>
-              <w:bottom w:type="dxa" w:w="70"/>
-              <w:right w:type="dxa" w:w="110"/>
-            </w:tcMar>
-          </w:tcPr>
-          <w:p>
-            <w:pPr>
-              <w:spacing w:after="0"/>
-            </w:pPr>
-            <w:r>
-              <w:rPr>
-                <w:color w:val="5F6368"/>
-                <w:sz w:val="17"/>
-                <w:szCs w:val="17"/>
-              </w:rPr>
-              <w:t xml:space="preserve">初ワンマン 東京・大阪 両公演</w:t>
-            </w:r>
-          </w:p>
-        </w:tc>
-        <w:tc>
-          <w:tcPr>
-            <w:tcW w:type="dxa" w:w="2425"/>
-            <w:tcMar>
-              <w:top w:type="dxa" w:w="70"/>
-              <w:left w:type="dxa" w:w="110"/>
-              <w:bottom w:type="dxa" w:w="70"/>
-              <w:right w:type="dxa" w:w="110"/>
-            </w:tcMar>
-          </w:tcPr>
-          <w:p>
-            <w:pPr>
-              <w:spacing w:after="0"/>
-            </w:pPr>
-            <w:r>
-              <w:rPr>
-                <w:color w:val="5F6368"/>
-                <w:sz w:val="17"/>
-                <w:szCs w:val="17"/>
-              </w:rPr>
-              <w:t xml:space="preserve">TikTok最大再生（葡萄クリップ）</w:t>
-            </w:r>
-          </w:p>
-        </w:tc>
-      </w:tr>
-    </w:tbl>
-    <w:p>
-      <w:pPr>
-        <w:spacing w:after="140" w:before="0"/>
-      </w:pPr>
-      <w:r>
-        <w:rPr>
-          <w:color w:val="1A1A1A"/>
-          <w:sz w:val="21"/>
-          <w:szCs w:val="21"/>
-        </w:rPr>
-        <w:t xml:space="preserve"/>
-      </w:r>
-    </w:p>
-    <w:p>
-      <w:pPr>
-        <w:pStyle w:val="Heading2"/>
-        <w:spacing w:after="110" w:before="240"/>
-      </w:pPr>
-      <w:r>
-        <w:rPr>
-          <w:b/>
-          <w:bCs/>
-          <w:color w:val="1A1A1A"/>
-          <w:sz w:val="23"/>
-          <w:szCs w:val="23"/>
-        </w:rPr>
-        <w:t xml:space="preserve">SNS ／ プラットフォーム別フォロワー数</w:t>
-      </w:r>
-    </w:p>
-    <w:tbl>
-      <w:tblPr>
-        <w:tblW w:type="dxa" w:w="9700"/>
-        <w:tblBorders>
-          <w:top w:val="single" w:color="D6D8DC" w:sz="4"/>
-          <w:left w:val="single" w:color="D6D8DC" w:sz="4"/>
-          <w:bottom w:val="single" w:color="D6D8DC" w:sz="4"/>
-          <w:right w:val="single" w:color="D6D8DC" w:sz="4"/>
-          <w:insideH w:val="single" w:color="D6D8DC" w:sz="4"/>
-          <w:insideV w:val="single" w:color="D6D8DC" w:sz="4"/>
-        </w:tblBorders>
-      </w:tblPr>
-      <w:tblGrid>
-        <w:gridCol w:w="1500"/>
-        <w:gridCol w:w="2400"/>
-        <w:gridCol w:w="2200"/>
-        <w:gridCol w:w="3600"/>
-      </w:tblGrid>
-      <w:tr>
-        <w:trPr>
-          <w:tblHeader/>
-        </w:trPr>
-        <w:tc>
-          <w:tcPr>
-            <w:tcW w:type="dxa" w:w="1500"/>
-            <w:shd w:fill="F1F3F5" w:color="auto" w:val="clear"/>
-            <w:tcMar>
-              <w:top w:type="dxa" w:w="70"/>
-              <w:left w:type="dxa" w:w="110"/>
-              <w:bottom w:type="dxa" w:w="70"/>
-              <w:right w:type="dxa" w:w="110"/>
-            </w:tcMar>
-          </w:tcPr>
-          <w:p>
-            <w:pPr>
-              <w:spacing w:after="0"/>
-            </w:pPr>
-            <w:r>
-              <w:rPr>
-                <w:b/>
-                <w:bCs/>
-                <w:color w:val="1A1A1A"/>
-                <w:sz w:val="19"/>
-                <w:szCs w:val="19"/>
-              </w:rPr>
-              <w:t xml:space="preserve">媒体</w:t>
-            </w:r>
-          </w:p>
-        </w:tc>
-        <w:tc>
-          <w:tcPr>
-            <w:tcW w:type="dxa" w:w="2400"/>
-            <w:shd w:fill="F1F3F5" w:color="auto" w:val="clear"/>
-            <w:tcMar>
-              <w:top w:type="dxa" w:w="70"/>
-              <w:left w:type="dxa" w:w="110"/>
-              <w:bottom w:type="dxa" w:w="70"/>
-              <w:right w:type="dxa" w:w="110"/>
-            </w:tcMar>
-          </w:tcPr>
-          <w:p>
-            <w:pPr>
-              <w:spacing w:after="0"/>
-            </w:pPr>
-            <w:r>
-              <w:rPr>
-                <w:b/>
-                <w:bCs/>
-                <w:color w:val="1A1A1A"/>
-                <w:sz w:val="19"/>
-                <w:szCs w:val="19"/>
-              </w:rPr>
-              <w:t xml:space="preserve">アカウント</w:t>
-            </w:r>
-          </w:p>
-        </w:tc>
-        <w:tc>
-          <w:tcPr>
-            <w:tcW w:type="dxa" w:w="2200"/>
-            <w:shd w:fill="F1F3F5" w:color="auto" w:val="clear"/>
-            <w:tcMar>
-              <w:top w:type="dxa" w:w="70"/>
-              <w:left w:type="dxa" w:w="110"/>
-              <w:bottom w:type="dxa" w:w="70"/>
-              <w:right w:type="dxa" w:w="110"/>
-            </w:tcMar>
-          </w:tcPr>
-          <w:p>
-            <w:pPr>
-              <w:spacing w:after="0"/>
-            </w:pPr>
-            <w:r>
-              <w:rPr>
-                <w:b/>
-                <w:bCs/>
-                <w:color w:val="1A1A1A"/>
-                <w:sz w:val="19"/>
-                <w:szCs w:val="19"/>
-              </w:rPr>
-              <w:t xml:space="preserve">規模</w:t>
-            </w:r>
-          </w:p>
-        </w:tc>
-        <w:tc>
-          <w:tcPr>
-            <w:tcW w:type="dxa" w:w="3600"/>
-            <w:shd w:fill="F1F3F5" w:color="auto" w:val="clear"/>
-            <w:tcMar>
-              <w:top w:type="dxa" w:w="70"/>
-              <w:left w:type="dxa" w:w="110"/>
-              <w:bottom w:type="dxa" w:w="70"/>
-              <w:right w:type="dxa" w:w="110"/>
-            </w:tcMar>
-          </w:tcPr>
-          <w:p>
-            <w:pPr>
-              <w:spacing w:after="0"/>
-            </w:pPr>
-            <w:r>
-              <w:rPr>
-                <w:b/>
-                <w:bCs/>
-                <w:color w:val="1A1A1A"/>
-                <w:sz w:val="19"/>
-                <w:szCs w:val="19"/>
-              </w:rPr>
-              <w:t xml:space="preserve">備考</w:t>
-            </w:r>
-          </w:p>
-        </w:tc>
-      </w:tr>
-      <w:tr>
-        <w:tc>
-          <w:tcPr>
-            <w:tcW w:type="dxa" w:w="1500"/>
-            <w:tcMar>
-              <w:top w:type="dxa" w:w="70"/>
-              <w:left w:type="dxa" w:w="110"/>
-              <w:bottom w:type="dxa" w:w="70"/>
-              <w:right w:type="dxa" w:w="110"/>
-            </w:tcMar>
-          </w:tcPr>
-          <w:p>
-            <w:pPr>
-              <w:spacing w:after="0"/>
-            </w:pPr>
-            <w:r>
-              <w:rPr>
-                <w:b/>
-                <w:bCs/>
-                <w:color w:val="1A1A1A"/>
-                <w:sz w:val="19"/>
-                <w:szCs w:val="19"/>
-              </w:rPr>
-              <w:t xml:space="preserve">TikTok</w:t>
-            </w:r>
-          </w:p>
-        </w:tc>
-        <w:tc>
-          <w:tcPr>
-            <w:tcW w:type="dxa" w:w="2400"/>
-            <w:tcMar>
-              <w:top w:type="dxa" w:w="70"/>
-              <w:left w:type="dxa" w:w="110"/>
-              <w:bottom w:type="dxa" w:w="70"/>
-              <w:right w:type="dxa" w:w="110"/>
-            </w:tcMar>
-          </w:tcPr>
-          <w:p>
-            <w:pPr>
-              <w:spacing w:after="0"/>
-            </w:pPr>
-            <w:r>
-              <w:rPr>
-                <w:color w:val="1A1A1A"/>
-                <w:sz w:val="19"/>
-                <w:szCs w:val="19"/>
-              </w:rPr>
-              <w:t xml:space="preserve">@vivanzeden_jp</w:t>
-            </w:r>
-          </w:p>
-        </w:tc>
-        <w:tc>
-          <w:tcPr>
-            <w:tcW w:type="dxa" w:w="2200"/>
-            <w:tcMar>
-              <w:top w:type="dxa" w:w="70"/>
-              <w:left w:type="dxa" w:w="110"/>
-              <w:bottom w:type="dxa" w:w="70"/>
-              <w:right w:type="dxa" w:w="110"/>
-            </w:tcMar>
-          </w:tcPr>
-          <w:p>
-            <w:pPr>
-              <w:spacing w:after="0"/>
-            </w:pPr>
-            <w:r>
-              <w:rPr>
-                <w:b/>
-                <w:bCs/>
-                <w:color w:val="1A1A1A"/>
-                <w:sz w:val="19"/>
-                <w:szCs w:val="19"/>
-              </w:rPr>
-              <w:t xml:space="preserve">フォロワー 11.98万</w:t>
-            </w:r>
-          </w:p>
-        </w:tc>
-        <w:tc>
-          <w:tcPr>
-            <w:tcW w:type="dxa" w:w="3600"/>
-            <w:tcMar>
-              <w:top w:type="dxa" w:w="70"/>
-              <w:left w:type="dxa" w:w="110"/>
-              <w:bottom w:type="dxa" w:w="70"/>
-              <w:right w:type="dxa" w:w="110"/>
-            </w:tcMar>
-          </w:tcPr>
-          <w:p>
-            <w:pPr>
-              <w:spacing w:after="0"/>
-            </w:pPr>
-            <w:r>
-              <w:rPr>
-                <w:color w:val="5F6368"/>
-                <w:sz w:val="17"/>
-                <w:szCs w:val="17"/>
-              </w:rPr>
-              <w:t xml:space="preserve">総いいね 230万 / 423投稿 / 認証済みアカウント</w:t>
-            </w:r>
-          </w:p>
-        </w:tc>
-      </w:tr>
-      <w:tr>
-        <w:tc>
-          <w:tcPr>
-            <w:tcW w:type="dxa" w:w="1500"/>
-            <w:tcMar>
-              <w:top w:type="dxa" w:w="70"/>
-              <w:left w:type="dxa" w:w="110"/>
-              <w:bottom w:type="dxa" w:w="70"/>
-              <w:right w:type="dxa" w:w="110"/>
-            </w:tcMar>
-          </w:tcPr>
-          <w:p>
-            <w:pPr>
-              <w:spacing w:after="0"/>
-            </w:pPr>
-            <w:r>
-              <w:rPr>
-                <w:b/>
-                <w:bCs/>
-                <w:color w:val="1A1A1A"/>
-                <w:sz w:val="19"/>
-                <w:szCs w:val="19"/>
-              </w:rPr>
-              <w:t xml:space="preserve">YouTube</w:t>
-            </w:r>
-          </w:p>
-        </w:tc>
-        <w:tc>
-          <w:tcPr>
-            <w:tcW w:type="dxa" w:w="2400"/>
-            <w:tcMar>
-              <w:top w:type="dxa" w:w="70"/>
-              <w:left w:type="dxa" w:w="110"/>
-              <w:bottom w:type="dxa" w:w="70"/>
-              <w:right w:type="dxa" w:w="110"/>
-            </w:tcMar>
-          </w:tcPr>
-          <w:p>
-            <w:pPr>
-              <w:spacing w:after="0"/>
-            </w:pPr>
-            <w:r>
-              <w:rPr>
-                <w:color w:val="1A1A1A"/>
-                <w:sz w:val="19"/>
-                <w:szCs w:val="19"/>
-              </w:rPr>
-              <w:t xml:space="preserve">@vivanzedenjp</w:t>
-            </w:r>
-          </w:p>
-        </w:tc>
-        <w:tc>
-          <w:tcPr>
-            <w:tcW w:type="dxa" w:w="2200"/>
-            <w:tcMar>
-              <w:top w:type="dxa" w:w="70"/>
-              <w:left w:type="dxa" w:w="110"/>
-              <w:bottom w:type="dxa" w:w="70"/>
-              <w:right w:type="dxa" w:w="110"/>
-            </w:tcMar>
-          </w:tcPr>
-          <w:p>
-            <w:pPr>
-              <w:spacing w:after="0"/>
-            </w:pPr>
-            <w:r>
-              <w:rPr>
-                <w:b/>
-                <w:bCs/>
-                <w:color w:val="1A1A1A"/>
-                <w:sz w:val="19"/>
-                <w:szCs w:val="19"/>
-              </w:rPr>
-              <w:t xml:space="preserve">登録者 3.75万</w:t>
-            </w:r>
-          </w:p>
-        </w:tc>
-        <w:tc>
-          <w:tcPr>
-            <w:tcW w:type="dxa" w:w="3600"/>
-            <w:tcMar>
-              <w:top w:type="dxa" w:w="70"/>
-              <w:left w:type="dxa" w:w="110"/>
-              <w:bottom w:type="dxa" w:w="70"/>
-              <w:right w:type="dxa" w:w="110"/>
-            </w:tcMar>
-          </w:tcPr>
-          <w:p>
-            <w:pPr>
-              <w:spacing w:after="0"/>
-            </w:pPr>
-            <w:r>
-              <w:rPr>
-                <w:color w:val="5F6368"/>
-                <w:sz w:val="17"/>
-                <w:szCs w:val="17"/>
-              </w:rPr>
-              <w:t xml:space="preserve">総再生 825.5万</w:t>
-            </w:r>
-          </w:p>
-        </w:tc>
-      </w:tr>
-      <w:tr>
-        <w:tc>
-          <w:tcPr>
-            <w:tcW w:type="dxa" w:w="1500"/>
-            <w:tcMar>
-              <w:top w:type="dxa" w:w="70"/>
-              <w:left w:type="dxa" w:w="110"/>
-              <w:bottom w:type="dxa" w:w="70"/>
-              <w:right w:type="dxa" w:w="110"/>
-            </w:tcMar>
-          </w:tcPr>
-          <w:p>
-            <w:pPr>
-              <w:spacing w:after="0"/>
-            </w:pPr>
-            <w:r>
-              <w:rPr>
-                <w:b/>
-                <w:bCs/>
-                <w:color w:val="1A1A1A"/>
-                <w:sz w:val="19"/>
-                <w:szCs w:val="19"/>
-              </w:rPr>
-              <w:t xml:space="preserve">Spotify</w:t>
-            </w:r>
-          </w:p>
-        </w:tc>
-        <w:tc>
-          <w:tcPr>
-            <w:tcW w:type="dxa" w:w="2400"/>
-            <w:tcMar>
-              <w:top w:type="dxa" w:w="70"/>
-              <w:left w:type="dxa" w:w="110"/>
-              <w:bottom w:type="dxa" w:w="70"/>
-              <w:right w:type="dxa" w:w="110"/>
-            </w:tcMar>
-          </w:tcPr>
-          <w:p>
-            <w:pPr>
-              <w:spacing w:after="0"/>
-            </w:pPr>
-            <w:r>
-              <w:rPr>
-                <w:color w:val="1A1A1A"/>
-                <w:sz w:val="19"/>
-                <w:szCs w:val="19"/>
-              </w:rPr>
-              <w:t xml:space="preserve">Vivanz Eden</w:t>
-            </w:r>
-          </w:p>
-        </w:tc>
-        <w:tc>
-          <w:tcPr>
-            <w:tcW w:type="dxa" w:w="2200"/>
-            <w:tcMar>
-              <w:top w:type="dxa" w:w="70"/>
-              <w:left w:type="dxa" w:w="110"/>
-              <w:bottom w:type="dxa" w:w="70"/>
-              <w:right w:type="dxa" w:w="110"/>
-            </w:tcMar>
-          </w:tcPr>
-          <w:p>
-            <w:pPr>
-              <w:spacing w:after="0"/>
-            </w:pPr>
-            <w:r>
-              <w:rPr>
-                <w:b/>
-                <w:bCs/>
-                <w:color w:val="1A1A1A"/>
-                <w:sz w:val="19"/>
-                <w:szCs w:val="19"/>
-              </w:rPr>
-              <w:t xml:space="preserve">月間リスナー 14.0万</w:t>
-            </w:r>
-          </w:p>
-        </w:tc>
-        <w:tc>
-          <w:tcPr>
-            <w:tcW w:type="dxa" w:w="3600"/>
-            <w:tcMar>
-              <w:top w:type="dxa" w:w="70"/>
-              <w:left w:type="dxa" w:w="110"/>
-              <w:bottom w:type="dxa" w:w="70"/>
-              <w:right w:type="dxa" w:w="110"/>
-            </w:tcMar>
-          </w:tcPr>
-          <w:p>
-            <w:pPr>
-              <w:spacing w:after="0"/>
-            </w:pPr>
-            <w:r>
-              <w:rPr>
-                <w:color w:val="5F6368"/>
-                <w:sz w:val="17"/>
-                <w:szCs w:val="17"/>
-              </w:rPr>
-              <w:t xml:space="preserve">フォロワー 1.8万 / 葡萄 111万再生</w:t>
-            </w:r>
-          </w:p>
-        </w:tc>
-      </w:tr>
-      <w:tr>
-        <w:tc>
-          <w:tcPr>
-            <w:tcW w:type="dxa" w:w="1500"/>
-            <w:tcMar>
-              <w:top w:type="dxa" w:w="70"/>
-              <w:left w:type="dxa" w:w="110"/>
-              <w:bottom w:type="dxa" w:w="70"/>
-              <w:right w:type="dxa" w:w="110"/>
-            </w:tcMar>
-          </w:tcPr>
-          <w:p>
-            <w:pPr>
-              <w:spacing w:after="0"/>
-            </w:pPr>
-            <w:r>
-              <w:rPr>
-                <w:b/>
-                <w:bCs/>
-                <w:color w:val="1A1A1A"/>
-                <w:sz w:val="19"/>
-                <w:szCs w:val="19"/>
-              </w:rPr>
-              <w:t xml:space="preserve">Instagram</w:t>
-            </w:r>
-          </w:p>
-        </w:tc>
-        <w:tc>
-          <w:tcPr>
-            <w:tcW w:type="dxa" w:w="2400"/>
-            <w:tcMar>
-              <w:top w:type="dxa" w:w="70"/>
-              <w:left w:type="dxa" w:w="110"/>
-              <w:bottom w:type="dxa" w:w="70"/>
-              <w:right w:type="dxa" w:w="110"/>
-            </w:tcMar>
-          </w:tcPr>
-          <w:p>
-            <w:pPr>
-              <w:spacing w:after="0"/>
-            </w:pPr>
-            <w:r>
-              <w:rPr>
-                <w:color w:val="1A1A1A"/>
-                <w:sz w:val="19"/>
-                <w:szCs w:val="19"/>
-              </w:rPr>
-              <w:t xml:space="preserve">@vivanzedenjp</w:t>
-            </w:r>
-          </w:p>
-        </w:tc>
-        <w:tc>
-          <w:tcPr>
-            <w:tcW w:type="dxa" w:w="2200"/>
-            <w:tcMar>
-              <w:top w:type="dxa" w:w="70"/>
-              <w:left w:type="dxa" w:w="110"/>
-              <w:bottom w:type="dxa" w:w="70"/>
-              <w:right w:type="dxa" w:w="110"/>
-            </w:tcMar>
-          </w:tcPr>
-          <w:p>
-            <w:pPr>
-              <w:spacing w:after="0"/>
-            </w:pPr>
-            <w:r>
-              <w:rPr>
-                <w:b/>
-                <w:bCs/>
-                <w:color w:val="1A1A1A"/>
-                <w:sz w:val="19"/>
-                <w:szCs w:val="19"/>
-              </w:rPr>
-              <w:t xml:space="preserve">—</w:t>
-            </w:r>
-          </w:p>
-        </w:tc>
-        <w:tc>
-          <w:tcPr>
-            <w:tcW w:type="dxa" w:w="3600"/>
-            <w:tcMar>
-              <w:top w:type="dxa" w:w="70"/>
-              <w:left w:type="dxa" w:w="110"/>
-              <w:bottom w:type="dxa" w:w="70"/>
-              <w:right w:type="dxa" w:w="110"/>
-            </w:tcMar>
-          </w:tcPr>
-          <w:p>
-            <w:pPr>
-              <w:spacing w:after="0"/>
-            </w:pPr>
-            <w:r>
-              <w:rPr>
-                <w:color w:val="5F6368"/>
-                <w:sz w:val="17"/>
-                <w:szCs w:val="17"/>
-              </w:rPr>
-              <w:t xml:space="preserve">レコーディング／ライブ告知</w:t>
-            </w:r>
-          </w:p>
-        </w:tc>
-      </w:tr>
-      <w:tr>
-        <w:tc>
-          <w:tcPr>
-            <w:tcW w:type="dxa" w:w="1500"/>
-            <w:tcMar>
-              <w:top w:type="dxa" w:w="70"/>
-              <w:left w:type="dxa" w:w="110"/>
-              <w:bottom w:type="dxa" w:w="70"/>
-              <w:right w:type="dxa" w:w="110"/>
-            </w:tcMar>
-          </w:tcPr>
-          <w:p>
-            <w:pPr>
-              <w:spacing w:after="0"/>
-            </w:pPr>
-            <w:r>
-              <w:rPr>
-                <w:b/>
-                <w:bCs/>
-                <w:color w:val="1A1A1A"/>
-                <w:sz w:val="19"/>
-                <w:szCs w:val="19"/>
-              </w:rPr>
-              <w:t xml:space="preserve">X</w:t>
-            </w:r>
-          </w:p>
-        </w:tc>
-        <w:tc>
-          <w:tcPr>
-            <w:tcW w:type="dxa" w:w="2400"/>
-            <w:tcMar>
-              <w:top w:type="dxa" w:w="70"/>
-              <w:left w:type="dxa" w:w="110"/>
-              <w:bottom w:type="dxa" w:w="70"/>
-              <w:right w:type="dxa" w:w="110"/>
-            </w:tcMar>
-          </w:tcPr>
-          <w:p>
-            <w:pPr>
-              <w:spacing w:after="0"/>
-            </w:pPr>
-            <w:r>
-              <w:rPr>
-                <w:color w:val="1A1A1A"/>
-                <w:sz w:val="19"/>
-                <w:szCs w:val="19"/>
-              </w:rPr>
-              <w:t xml:space="preserve">@VivanzEden / @__ryomakikuchi</w:t>
-            </w:r>
-          </w:p>
-        </w:tc>
-        <w:tc>
-          <w:tcPr>
-            <w:tcW w:type="dxa" w:w="2200"/>
-            <w:tcMar>
-              <w:top w:type="dxa" w:w="70"/>
-              <w:left w:type="dxa" w:w="110"/>
-              <w:bottom w:type="dxa" w:w="70"/>
-              <w:right w:type="dxa" w:w="110"/>
-            </w:tcMar>
-          </w:tcPr>
-          <w:p>
-            <w:pPr>
-              <w:spacing w:after="0"/>
-            </w:pPr>
-            <w:r>
-              <w:rPr>
-                <w:b/>
-                <w:bCs/>
-                <w:color w:val="1A1A1A"/>
-                <w:sz w:val="19"/>
-                <w:szCs w:val="19"/>
-              </w:rPr>
-              <w:t xml:space="preserve">—</w:t>
-            </w:r>
-          </w:p>
-        </w:tc>
-        <w:tc>
-          <w:tcPr>
-            <w:tcW w:type="dxa" w:w="3600"/>
-            <w:tcMar>
-              <w:top w:type="dxa" w:w="70"/>
-              <w:left w:type="dxa" w:w="110"/>
-              <w:bottom w:type="dxa" w:w="70"/>
-              <w:right w:type="dxa" w:w="110"/>
-            </w:tcMar>
-          </w:tcPr>
-          <w:p>
-            <w:pPr>
-              <w:spacing w:after="0"/>
-            </w:pPr>
-            <w:r>
-              <w:rPr>
-                <w:color w:val="5F6368"/>
-                <w:sz w:val="17"/>
-                <w:szCs w:val="17"/>
-              </w:rPr>
-              <w:t xml:space="preserve">菊地個人アカウントあり</w:t>
-            </w:r>
-          </w:p>
-        </w:tc>
-      </w:tr>
-    </w:tbl>
-    <w:p>
-      <w:pPr>
-        <w:spacing w:after="160" w:before="0"/>
-      </w:pPr>
-      <w:r>
-        <w:rPr>
-          <w:color w:val="1A1A1A"/>
-          <w:sz w:val="21"/>
-          <w:szCs w:val="21"/>
-        </w:rPr>
-        <w:t xml:space="preserve"/>
-      </w:r>
-    </w:p>
-    <w:p>
-      <w:pPr>
-        <w:pStyle w:val="Heading2"/>
-        <w:spacing w:after="110" w:before="240"/>
-      </w:pPr>
-      <w:r>
-        <w:rPr>
-          <w:b/>
-          <w:bCs/>
-          <w:color w:val="1A1A1A"/>
-          <w:sz w:val="23"/>
-          <w:szCs w:val="23"/>
-        </w:rPr>
-        <w:t xml:space="preserve">音楽性</w:t>
-      </w:r>
-    </w:p>
-    <w:p>
-      <w:pPr>
-        <w:pStyle w:val="ListParagraph"/>
-        <w:numPr>
-          <w:ilvl w:val="0"/>
-          <w:numId w:val="2"/>
-        </w:numPr>
-        <w:spacing w:after="90"/>
-      </w:pPr>
-      <w:r>
-        <w:rPr>
-          <w:color w:val="1A1A1A"/>
-          <w:sz w:val="21"/>
-          <w:szCs w:val="21"/>
-        </w:rPr>
-        <w:t xml:space="preserve">ロック／ポップス／R&amp;B／ボカロを横断するジャンルレス。武器は菊地諒真の歌唱力（ミックスボイスを含む声域と音圧）で、バンドの編成よりも「声」が先に立つ構造。</w:t>
-      </w:r>
-    </w:p>
-    <w:p>
-      <w:pPr>
-        <w:pStyle w:val="ListParagraph"/>
-        <w:numPr>
-          <w:ilvl w:val="0"/>
-          <w:numId w:val="2"/>
-        </w:numPr>
-        <w:spacing w:after="90"/>
-      </w:pPr>
-      <w:r>
-        <w:rPr>
-          <w:color w:val="1A1A1A"/>
-          <w:sz w:val="21"/>
-          <w:szCs w:val="21"/>
-        </w:rPr>
-        <w:t xml:space="preserve">リリースは 葡萄（2026/5/27・作詞作曲 菊地諒真／編曲 菊地諒真・福島章嗣）、春うらら、美学、マルベリー、ETA、透明（松浦航大とのコラボ）、ワインレッドナイト ほか。アルバム『offbase』『青果』（2024）。</w:t>
-      </w:r>
-    </w:p>
-    <w:p>
-      <w:pPr>
-        <w:pStyle w:val="ListParagraph"/>
-        <w:numPr>
-          <w:ilvl w:val="0"/>
-          <w:numId w:val="2"/>
-        </w:numPr>
-        <w:spacing w:after="90"/>
-      </w:pPr>
-      <w:r>
-        <w:rPr>
-          <w:color w:val="1A1A1A"/>
-          <w:sz w:val="21"/>
-          <w:szCs w:val="21"/>
-        </w:rPr>
-        <w:t xml:space="preserve">DSP実績：葡萄 111万／ワインレッドナイト 41.6万／MULBERRY 23.1万／透明 14.8万／ETA 10.9万。YouTubeは 葡萄MV 84万／ワインレッドナイト 23万／マルベリー 17万／透明MV 15万。</w:t>
-      </w:r>
-    </w:p>
-    <w:p>
-      <w:pPr>
-        <w:pStyle w:val="ListParagraph"/>
-        <w:numPr>
-          <w:ilvl w:val="0"/>
-          <w:numId w:val="2"/>
-        </w:numPr>
-        <w:spacing w:after="90"/>
-      </w:pPr>
-      <w:r>
-        <w:rPr>
-          <w:color w:val="1A1A1A"/>
-          <w:sz w:val="21"/>
-          <w:szCs w:val="21"/>
-        </w:rPr>
-        <w:t xml:space="preserve">菊地はTikTok LIVEで back number「助演女優症2」、藤井風「満ちてゆく」などを弾き語り。カバー時の反応が本人の楽曲と同等以上に取れており、“歌える人”としての支持が数字で見えている。</w:t>
-      </w:r>
-    </w:p>
-    <w:p>
-      <w:pPr>
-        <w:pStyle w:val="Heading2"/>
-        <w:spacing w:after="110" w:before="240"/>
-      </w:pPr>
-      <w:r>
-        <w:rPr>
-          <w:b/>
-          <w:bCs/>
-          <w:color w:val="1A1A1A"/>
-          <w:sz w:val="23"/>
-          <w:szCs w:val="23"/>
-        </w:rPr>
-        <w:t xml:space="preserve">何が魅力なのか</w:t>
-      </w:r>
-    </w:p>
-    <w:p>
-      <w:pPr>
-        <w:pStyle w:val="ListParagraph"/>
-        <w:numPr>
-          <w:ilvl w:val="0"/>
-          <w:numId w:val="2"/>
-        </w:numPr>
-        <w:spacing w:after="110"/>
-      </w:pPr>
-      <w:r>
-        <w:rPr>
-          <w:b/>
-          <w:bCs/>
-          <w:color w:val="1A1A1A"/>
-          <w:sz w:val="21"/>
-          <w:szCs w:val="21"/>
-        </w:rPr>
-        <w:t xml:space="preserve">本命は菊地諒真のボーカル　</w:t>
-      </w:r>
-      <w:r>
-        <w:rPr>
-          <w:color w:val="1A1A1A"/>
-          <w:sz w:val="21"/>
-          <w:szCs w:val="21"/>
-        </w:rPr>
-        <w:t xml:space="preserve">1曲で100万再生を作り、弾き語りカバーでも同じだけ刺さる。バンドの機能というより「この声を聴きたい」で人が集まっている状態。back number 的な“国民的歌声”の枠に最も近い。</w:t>
-      </w:r>
-    </w:p>
-    <w:p>
-      <w:pPr>
-        <w:pStyle w:val="ListParagraph"/>
-        <w:numPr>
-          <w:ilvl w:val="0"/>
-          <w:numId w:val="2"/>
-        </w:numPr>
-        <w:spacing w:after="110"/>
-      </w:pPr>
-      <w:r>
-        <w:rPr>
-          <w:b/>
-          <w:bCs/>
-          <w:color w:val="1A1A1A"/>
-          <w:sz w:val="21"/>
-          <w:szCs w:val="21"/>
-        </w:rPr>
-        <w:t xml:space="preserve">作詞作曲が本人　</w:t>
-      </w:r>
-      <w:r>
-        <w:rPr>
-          <w:color w:val="1A1A1A"/>
-          <w:sz w:val="21"/>
-          <w:szCs w:val="21"/>
-        </w:rPr>
-        <w:t xml:space="preserve">全曲を菊地が書いている。声だけの人ではなく、曲を書ける人。制作コストが低く、リリースサイクルを我々が設計すればすぐ回せる。</w:t>
-      </w:r>
-    </w:p>
-    <w:p>
-      <w:pPr>
-        <w:pStyle w:val="ListParagraph"/>
-        <w:numPr>
-          <w:ilvl w:val="0"/>
-          <w:numId w:val="2"/>
-        </w:numPr>
-        <w:spacing w:after="110"/>
-      </w:pPr>
-      <w:r>
-        <w:rPr>
-          <w:b/>
-          <w:bCs/>
-          <w:color w:val="1A1A1A"/>
-          <w:sz w:val="21"/>
-          <w:szCs w:val="21"/>
-        </w:rPr>
-        <w:t xml:space="preserve">「実需」がある　</w:t>
-      </w:r>
-      <w:r>
-        <w:rPr>
-          <w:color w:val="1A1A1A"/>
-          <w:sz w:val="21"/>
-          <w:szCs w:val="21"/>
-        </w:rPr>
-        <w:t xml:space="preserve">月間14万リスナー、初ワンマン東京・大阪 両公演SOLD OUT、追加公演発表。SNSの数字ではなくチケットと再生というお金の動く指標で実証済み。</w:t>
-      </w:r>
-    </w:p>
-    <w:p>
-      <w:pPr>
-        <w:pStyle w:val="ListParagraph"/>
-        <w:numPr>
-          <w:ilvl w:val="0"/>
-          <w:numId w:val="2"/>
-        </w:numPr>
-        <w:spacing w:after="110"/>
-      </w:pPr>
-      <w:r>
-        <w:rPr>
-          <w:b/>
-          <w:bCs/>
-          <w:color w:val="1A1A1A"/>
-          <w:sz w:val="21"/>
-          <w:szCs w:val="21"/>
-        </w:rPr>
-        <w:t xml:space="preserve">TikTokの当て方が上手い　</w:t>
-      </w:r>
-      <w:r>
-        <w:rPr>
-          <w:color w:val="1A1A1A"/>
-          <w:sz w:val="21"/>
-          <w:szCs w:val="21"/>
-        </w:rPr>
-        <w:t xml:space="preserve">「どこの歌詞が好き？」「この曲どう？」型の投げかけで、1曲を切り口を変えて何度も当てている（110万再生でER13.6%／保存2.9万／シェア1.34万）。運用ノウハウが既にある。</w:t>
-      </w:r>
-    </w:p>
-    <w:p>
-      <w:pPr>
-        <w:pStyle w:val="ListParagraph"/>
-        <w:numPr>
-          <w:ilvl w:val="0"/>
-          <w:numId w:val="2"/>
-        </w:numPr>
-        <w:spacing w:after="110"/>
-      </w:pPr>
-      <w:r>
-        <w:rPr>
-          <w:b/>
-          <w:bCs/>
-          <w:color w:val="1A1A1A"/>
-          <w:sz w:val="21"/>
-          <w:szCs w:val="21"/>
-        </w:rPr>
-        <w:t xml:space="preserve">外部評価の下地　</w:t>
-      </w:r>
-      <w:r>
-        <w:rPr>
-          <w:color w:val="1A1A1A"/>
-          <w:sz w:val="21"/>
-          <w:szCs w:val="21"/>
-        </w:rPr>
-        <w:t xml:space="preserve">ROJACK掲載、NACK5『ラジアナ』ゲスト、Podcast『Harbor Blue Studio』#186/#187 出演、松浦航大とのコラボ。“業界内で名前が回り始めている”段階。</w:t>
-      </w:r>
-    </w:p>
-    <w:p>
-      <w:pPr>
-        <w:pStyle w:val="Heading2"/>
-        <w:spacing w:after="110" w:before="240"/>
-      </w:pPr>
-      <w:r>
-        <w:rPr>
-          <w:b/>
-          <w:bCs/>
-          <w:color w:val="1A1A1A"/>
-          <w:sz w:val="23"/>
-          <w:szCs w:val="23"/>
-        </w:rPr>
-        <w:t xml:space="preserve">いま起きている“詰まり”</w:t>
-      </w:r>
-    </w:p>
-    <w:p>
-      <w:pPr>
-        <w:spacing w:after="160" w:before="0"/>
-      </w:pPr>
-      <w:r>
-        <w:rPr>
-          <w:color w:val="1A1A1A"/>
-          <w:sz w:val="21"/>
-          <w:szCs w:val="21"/>
-        </w:rPr>
-        <w:t xml:space="preserve">「葡萄」の一発は当たったが、それを連打に変える制作・流通体制がない。TikTok 11.98万に対しSpotify月間14万＝すでにSNS以上に音楽で聴かれている稀なタイプなのに、供給が追いついていない。バンドとしての機能が弱い分、菊地の声を主役に据えた座組の再設計が最短距離。</w:t>
-      </w:r>
-    </w:p>
-    <w:p>
-      <w:pPr>
-        <w:pStyle w:val="Heading2"/>
-        <w:spacing w:after="110" w:before="240"/>
-      </w:pPr>
-      <w:r>
-        <w:rPr>
-          <w:b/>
-          <w:bCs/>
-          <w:color w:val="1A1A1A"/>
-          <w:sz w:val="23"/>
-          <w:szCs w:val="23"/>
-        </w:rPr>
-        <w:t xml:space="preserve">ヒットへの手がかり — レーベルは何をしたら売れるか</w:t>
-      </w:r>
-    </w:p>
-    <w:p>
-      <w:pPr>
-        <w:pStyle w:val="ListParagraph"/>
-        <w:numPr>
-          <w:ilvl w:val="0"/>
-          <w:numId w:val="2"/>
-        </w:numPr>
-        <w:spacing w:after="110"/>
-      </w:pPr>
-      <w:r>
-        <w:rPr>
-          <w:b/>
-          <w:bCs/>
-          <w:color w:val="1A1A1A"/>
-          <w:sz w:val="21"/>
-          <w:szCs w:val="21"/>
-        </w:rPr>
-        <w:t xml:space="preserve">1）菊地の声を主役に置いた制作体制に組み替える　</w:t>
-      </w:r>
-      <w:r>
-        <w:rPr>
-          <w:color w:val="1A1A1A"/>
-          <w:sz w:val="21"/>
-          <w:szCs w:val="21"/>
-        </w:rPr>
-        <w:t xml:space="preserve">バンド名は資産なので維持しつつ、制作は「菊地＝シンガーソングライター＋外部アレンジャー／スタジオミュージシャン」に切り替える。3ピースの演奏力に制約されず、声が最大化されるアレンジを付けられる。</w:t>
-      </w:r>
-    </w:p>
-    <w:p>
-      <w:pPr>
-        <w:pStyle w:val="ListParagraph"/>
-        <w:numPr>
-          <w:ilvl w:val="0"/>
-          <w:numId w:val="2"/>
-        </w:numPr>
-        <w:spacing w:after="110"/>
-      </w:pPr>
-      <w:r>
-        <w:rPr>
-          <w:b/>
-          <w:bCs/>
-          <w:color w:val="1A1A1A"/>
-          <w:sz w:val="21"/>
-          <w:szCs w:val="21"/>
-        </w:rPr>
-        <w:t xml:space="preserve">2）「葡萄」の当たりを曲の連打に変える　</w:t>
-      </w:r>
-      <w:r>
-        <w:rPr>
-          <w:color w:val="1A1A1A"/>
-          <w:sz w:val="21"/>
-          <w:szCs w:val="21"/>
-        </w:rPr>
-        <w:t xml:space="preserve">月間14万リスナーが乗っている今、3ヶ月に1曲では足りない。プリプロを外に出して6〜8週間に1曲のサイクルへ。すでに「Always」制作中との発信もあり、タイミングは今。</w:t>
-      </w:r>
-    </w:p>
-    <w:p>
-      <w:pPr>
-        <w:pStyle w:val="ListParagraph"/>
-        <w:numPr>
-          <w:ilvl w:val="0"/>
-          <w:numId w:val="2"/>
-        </w:numPr>
-        <w:spacing w:after="110"/>
-      </w:pPr>
-      <w:r>
-        <w:rPr>
-          <w:b/>
-          <w:bCs/>
-          <w:color w:val="1A1A1A"/>
-          <w:sz w:val="21"/>
-          <w:szCs w:val="21"/>
-        </w:rPr>
-        <w:t xml:space="preserve">3）弾き語りカバー資産を正面から商品化　</w:t>
-      </w:r>
-      <w:r>
-        <w:rPr>
-          <w:color w:val="1A1A1A"/>
-          <w:sz w:val="21"/>
-          <w:szCs w:val="21"/>
-        </w:rPr>
-        <w:t xml:space="preserve">back number／藤井風のカバーが刺さっている。カバー配信EPかライブ盤（許諾込み）で、“歌がうまい人”としての一般認知を先に取る。オリジナルより早く広い層に届く。</w:t>
-      </w:r>
-    </w:p>
-    <w:p>
-      <w:pPr>
-        <w:pStyle w:val="ListParagraph"/>
-        <w:numPr>
-          <w:ilvl w:val="0"/>
-          <w:numId w:val="2"/>
-        </w:numPr>
-        <w:spacing w:after="110"/>
-      </w:pPr>
-      <w:r>
-        <w:rPr>
-          <w:b/>
-          <w:bCs/>
-          <w:color w:val="1A1A1A"/>
-          <w:sz w:val="21"/>
-          <w:szCs w:val="21"/>
-        </w:rPr>
-        <w:t xml:space="preserve">4）ライブが売れる強みでP/Lを先に立てる　</w:t>
-      </w:r>
-      <w:r>
-        <w:rPr>
-          <w:color w:val="1A1A1A"/>
-          <w:sz w:val="21"/>
-          <w:szCs w:val="21"/>
-        </w:rPr>
-        <w:t xml:space="preserve">初ワンマンで東名阪級が完売する動員力。ツアー規模拡大＋物販設計で、音源が育つ前にキャッシュを回せる。契約条件の説明もしやすい。</w:t>
-      </w:r>
-    </w:p>
-    <w:p>
-      <w:pPr>
-        <w:pStyle w:val="ListParagraph"/>
-        <w:numPr>
-          <w:ilvl w:val="0"/>
-          <w:numId w:val="2"/>
-        </w:numPr>
-        <w:spacing w:after="110"/>
-      </w:pPr>
-      <w:r>
-        <w:rPr>
-          <w:b/>
-          <w:bCs/>
-          <w:color w:val="1A1A1A"/>
-          <w:sz w:val="21"/>
-          <w:szCs w:val="21"/>
-        </w:rPr>
-        <w:t xml:space="preserve">5）タイアップは“声質”で取りにいく　</w:t>
-      </w:r>
-      <w:r>
-        <w:rPr>
-          <w:color w:val="1A1A1A"/>
-          <w:sz w:val="21"/>
-          <w:szCs w:val="21"/>
-        </w:rPr>
-        <w:t xml:space="preserve">ドラマ・アニメの主題歌枠は歌声の説得力で決まる。葡萄／透明の音源をそのまま提案材料にできる完成度がある。</w:t>
-      </w:r>
-    </w:p>
-    <w:p>
-      <w:pPr>
-        <w:pStyle w:val="Heading2"/>
-        <w:spacing w:after="110" w:before="240"/>
-      </w:pPr>
-      <w:r>
-        <w:rPr>
-          <w:b/>
-          <w:bCs/>
-          <w:color w:val="1A1A1A"/>
-          <w:sz w:val="23"/>
-          <w:szCs w:val="23"/>
-        </w:rPr>
-        <w:t xml:space="preserve">おすすめ参考動画</w:t>
-      </w:r>
-    </w:p>
-    <w:p>
-      <w:pPr>
-        <w:pStyle w:val="ListParagraph"/>
-        <w:numPr>
-          <w:ilvl w:val="0"/>
-          <w:numId w:val="2"/>
-        </w:numPr>
-        <w:spacing w:after="110"/>
-      </w:pPr>
-      <w:r>
-        <w:rPr>
-          <w:color w:val="1A1A1A"/>
-          <w:sz w:val="21"/>
-          <w:szCs w:val="21"/>
-        </w:rPr>
-        <w:t xml:space="preserve">【本命】Vivanz Eden「葡萄」Music Video（YouTube・84万再生）</w:t>
-      </w:r>
-      <w:r>
-        <w:rPr>
-          <w:sz w:val="21"/>
-          <w:szCs w:val="21"/>
-        </w:rPr>
-        <w:t xml:space="preserve">　</w:t>
-      </w:r>
-      <w:hyperlink w:history="1" r:id="rIdazac1rs29x5f0dxaipiqb">
-        <w:r>
-          <w:rPr>
-            <w:color w:val="1155CC"/>
-            <w:sz w:val="19"/>
-            <w:szCs w:val="19"/>
-            <w:u w:val="single"/>
-          </w:rPr>
-          <w:t xml:space="preserve">https://www.youtube.com/watch?v=eAstqpJPMgA</w:t>
-        </w:r>
-      </w:hyperlink>
-      <w:r>
-        <w:rPr>
-          <w:i/>
-          <w:iCs/>
-          <w:color w:val="5F6368"/>
-          <w:sz w:val="19"/>
-          <w:szCs w:val="19"/>
-        </w:rPr>
-        <w:t xml:space="preserve">　→ 代表曲。まずこれで声を聴かせる。</w:t>
-      </w:r>
-    </w:p>
-    <w:p>
-      <w:pPr>
-        <w:pStyle w:val="ListParagraph"/>
-        <w:numPr>
-          <w:ilvl w:val="0"/>
-          <w:numId w:val="2"/>
-        </w:numPr>
-        <w:spacing w:after="110"/>
-      </w:pPr>
-      <w:r>
-        <w:rPr>
-          <w:color w:val="1A1A1A"/>
-          <w:sz w:val="21"/>
-          <w:szCs w:val="21"/>
-        </w:rPr>
-        <w:t xml:space="preserve">「葡萄」TikTokクリップ（110万再生／ER13.6%／保存2.9万）</w:t>
-      </w:r>
-      <w:r>
-        <w:rPr>
-          <w:sz w:val="21"/>
-          <w:szCs w:val="21"/>
-        </w:rPr>
-        <w:t xml:space="preserve">　</w:t>
-      </w:r>
-      <w:hyperlink w:history="1" r:id="rIdzyxxa6a_6yrssfhzhkbrx">
-        <w:r>
-          <w:rPr>
-            <w:color w:val="1155CC"/>
-            <w:sz w:val="19"/>
-            <w:szCs w:val="19"/>
-            <w:u w:val="single"/>
-          </w:rPr>
-          <w:t xml:space="preserve">https://www.tiktok.com/@vivanzeden_jp/video/7652617742779976981</w:t>
-        </w:r>
-      </w:hyperlink>
-      <w:r>
-        <w:rPr>
-          <w:i/>
-          <w:iCs/>
-          <w:color w:val="5F6368"/>
-          <w:sz w:val="19"/>
-          <w:szCs w:val="19"/>
-        </w:rPr>
-        <w:t xml:space="preserve">　→ 1曲を切り口を変えて何度も当てる運用力。</w:t>
-      </w:r>
-    </w:p>
-    <w:p>
-      <w:pPr>
-        <w:pStyle w:val="ListParagraph"/>
-        <w:numPr>
-          <w:ilvl w:val="0"/>
-          <w:numId w:val="2"/>
-        </w:numPr>
-        <w:spacing w:after="110"/>
-      </w:pPr>
-      <w:r>
-        <w:rPr>
-          <w:color w:val="1A1A1A"/>
-          <w:sz w:val="21"/>
-          <w:szCs w:val="21"/>
-        </w:rPr>
-        <w:t xml:space="preserve">菊地諒真 弾き語り／back number「助演女優症2」（TikTok切り抜き）</w:t>
-      </w:r>
-      <w:r>
-        <w:rPr>
-          <w:sz w:val="21"/>
-          <w:szCs w:val="21"/>
-        </w:rPr>
-        <w:t xml:space="preserve">　</w:t>
-      </w:r>
-      <w:hyperlink w:history="1" r:id="rIdodlx9hdfoqpuz71z8sypv">
-        <w:r>
-          <w:rPr>
-            <w:color w:val="1155CC"/>
-            <w:sz w:val="19"/>
-            <w:szCs w:val="19"/>
-            <w:u w:val="single"/>
-          </w:rPr>
-          <w:t xml:space="preserve">https://www.tiktok.com/@shogohamada1229/video/7506809303290940690</w:t>
-        </w:r>
-      </w:hyperlink>
-      <w:r>
-        <w:rPr>
-          <w:i/>
-          <w:iCs/>
-          <w:color w:val="5F6368"/>
-          <w:sz w:val="19"/>
-          <w:szCs w:val="19"/>
-        </w:rPr>
-        <w:t xml:space="preserve">　→ 「次のback number枠」という提案の根拠。声一本での説得力を見せる。</w:t>
-      </w:r>
-    </w:p>
-    <w:p>
-      <w:pPr>
-        <w:pStyle w:val="ListParagraph"/>
-        <w:numPr>
-          <w:ilvl w:val="0"/>
-          <w:numId w:val="2"/>
-        </w:numPr>
-        <w:spacing w:after="110"/>
-      </w:pPr>
-      <w:r>
-        <w:rPr>
-          <w:color w:val="1A1A1A"/>
-          <w:sz w:val="21"/>
-          <w:szCs w:val="21"/>
-        </w:rPr>
-        <w:t xml:space="preserve">Vivanz Eden「透明」Music Video（松浦航大コラボ・15万再生）</w:t>
-      </w:r>
-      <w:r>
-        <w:rPr>
-          <w:sz w:val="21"/>
-          <w:szCs w:val="21"/>
-        </w:rPr>
-        <w:t xml:space="preserve">　</w:t>
-      </w:r>
-      <w:hyperlink w:history="1" r:id="rIdba1ygswygoy1oopcw8oci">
-        <w:r>
-          <w:rPr>
-            <w:color w:val="1155CC"/>
-            <w:sz w:val="19"/>
-            <w:szCs w:val="19"/>
-            <w:u w:val="single"/>
-          </w:rPr>
-          <w:t xml:space="preserve">https://www.youtube.com/watch?v=doS0m4KjHQU</w:t>
-        </w:r>
-      </w:hyperlink>
-      <w:r>
-        <w:rPr>
-          <w:i/>
-          <w:iCs/>
-          <w:color w:val="5F6368"/>
-          <w:sz w:val="19"/>
-          <w:szCs w:val="19"/>
-        </w:rPr>
-        <w:t xml:space="preserve">　→ 歌い手／ボーカリスト文脈での評価。外部との噛み合わせ。</w:t>
-      </w:r>
-    </w:p>
-    <w:p>
-      <w:pPr>
-        <w:pStyle w:val="Heading2"/>
-        <w:spacing w:after="110" w:before="240"/>
-      </w:pPr>
-      <w:r>
-        <w:rPr>
-          <w:b/>
-          <w:bCs/>
-          <w:color w:val="1A1A1A"/>
-          <w:sz w:val="23"/>
-          <w:szCs w:val="23"/>
-        </w:rPr>
-        <w:t xml:space="preserve">留意点 ／ 確認事項</w:t>
-      </w:r>
-    </w:p>
-    <w:p>
-      <w:pPr>
-        <w:spacing w:after="160" w:before="0"/>
-      </w:pPr>
-      <w:r>
-        <w:rPr>
-          <w:color w:val="1A1A1A"/>
-          <w:sz w:val="21"/>
-          <w:szCs w:val="21"/>
-        </w:rPr>
-        <w:t xml:space="preserve">前回（2025/7/22）当部門から提出済み案件のため、今回は「菊地のボーカル軸」という切り口の違いを明確にする必要あり。バンド内の合意形成（座組変更を受け入れられるか）と、8月ワンマン後の他社接触リスクが論点。</w:t>
-      </w:r>
-    </w:p>
-    <w:p>
-      <w:pPr>
-        <w:pStyle w:val="Heading2"/>
-        <w:spacing w:after="110" w:before="240"/>
-      </w:pPr>
-      <w:r>
-        <w:rPr>
-          <w:b/>
-          <w:bCs/>
-          <w:color w:val="1A1A1A"/>
-          <w:sz w:val="23"/>
-          <w:szCs w:val="23"/>
-        </w:rPr>
-        <w:t xml:space="preserve">5分プレゼンの進め方（目安）</w:t>
-      </w:r>
-    </w:p>
-    <w:tbl>
-      <w:tblPr>
-        <w:tblW w:type="dxa" w:w="9700"/>
-        <w:tblBorders>
-          <w:top w:val="single" w:color="D6D8DC" w:sz="4"/>
-          <w:left w:val="single" w:color="D6D8DC" w:sz="4"/>
-          <w:bottom w:val="single" w:color="D6D8DC" w:sz="4"/>
-          <w:right w:val="single" w:color="D6D8DC" w:sz="4"/>
-          <w:insideH w:val="single" w:color="D6D8DC" w:sz="4"/>
-          <w:insideV w:val="single" w:color="D6D8DC" w:sz="4"/>
-        </w:tblBorders>
-      </w:tblPr>
-      <w:tblGrid>
-        <w:gridCol w:w="1500"/>
-        <w:gridCol w:w="8200"/>
-      </w:tblGrid>
-      <w:tr>
-        <w:trPr>
-          <w:tblHeader/>
-        </w:trPr>
-        <w:tc>
-          <w:tcPr>
-            <w:tcW w:type="dxa" w:w="1500"/>
-            <w:shd w:fill="F1F3F5" w:color="auto" w:val="clear"/>
-            <w:tcMar>
-              <w:top w:type="dxa" w:w="70"/>
-              <w:left w:type="dxa" w:w="110"/>
-              <w:bottom w:type="dxa" w:w="70"/>
-              <w:right w:type="dxa" w:w="110"/>
-            </w:tcMar>
-          </w:tcPr>
-          <w:p>
-            <w:pPr>
-              <w:spacing w:after="0"/>
-            </w:pPr>
-            <w:r>
-              <w:rPr>
-                <w:b/>
-                <w:bCs/>
-                <w:color w:val="1A1A1A"/>
-                <w:sz w:val="19"/>
-                <w:szCs w:val="19"/>
-              </w:rPr>
-              <w:t xml:space="preserve">時間</w:t>
-            </w:r>
-          </w:p>
-        </w:tc>
-        <w:tc>
-          <w:tcPr>
-            <w:tcW w:type="dxa" w:w="8200"/>
-            <w:shd w:fill="F1F3F5" w:color="auto" w:val="clear"/>
-            <w:tcMar>
-              <w:top w:type="dxa" w:w="70"/>
-              <w:left w:type="dxa" w:w="110"/>
-              <w:bottom w:type="dxa" w:w="70"/>
-              <w:right w:type="dxa" w:w="110"/>
-            </w:tcMar>
-          </w:tcPr>
-          <w:p>
-            <w:pPr>
-              <w:spacing w:after="0"/>
-            </w:pPr>
-            <w:r>
-              <w:rPr>
-                <w:b/>
-                <w:bCs/>
-                <w:color w:val="1A1A1A"/>
-                <w:sz w:val="19"/>
-                <w:szCs w:val="19"/>
-              </w:rPr>
-              <w:t xml:space="preserve">話すこと</w:t>
-            </w:r>
-          </w:p>
-        </w:tc>
-      </w:tr>
-      <w:tr>
-        <w:tc>
-          <w:tcPr>
-            <w:tcW w:type="dxa" w:w="1500"/>
-            <w:tcMar>
-              <w:top w:type="dxa" w:w="70"/>
-              <w:left w:type="dxa" w:w="110"/>
-              <w:bottom w:type="dxa" w:w="70"/>
-              <w:right w:type="dxa" w:w="110"/>
-            </w:tcMar>
-          </w:tcPr>
-          <w:p>
-            <w:pPr>
-              <w:spacing w:after="0"/>
-            </w:pPr>
-            <w:r>
-              <w:rPr>
-                <w:b/>
-                <w:bCs/>
-                <w:color w:val="1A1A1A"/>
-                <w:sz w:val="19"/>
-                <w:szCs w:val="19"/>
-              </w:rPr>
-              <w:t xml:space="preserve">0:00–0:30</w:t>
-            </w:r>
-          </w:p>
-        </w:tc>
-        <w:tc>
-          <w:tcPr>
-            <w:tcW w:type="dxa" w:w="8200"/>
-            <w:tcMar>
-              <w:top w:type="dxa" w:w="70"/>
-              <w:left w:type="dxa" w:w="110"/>
-              <w:bottom w:type="dxa" w:w="70"/>
-              <w:right w:type="dxa" w:w="110"/>
-            </w:tcMar>
-          </w:tcPr>
-          <w:p>
-            <w:pPr>
-              <w:spacing w:after="0"/>
-            </w:pPr>
-            <w:r>
-              <w:rPr>
-                <w:color w:val="1A1A1A"/>
-                <w:sz w:val="19"/>
-                <w:szCs w:val="19"/>
-              </w:rPr>
-              <w:t xml:space="preserve">キャッチコピー「「葡萄」で証明済み。次のback numberは、この声から。」から入る。Spotify月間14万リスナー／初ワンマン東名阪SOLD OUT／全曲 菊地諒真 作詞作曲。</w:t>
-            </w:r>
-          </w:p>
-        </w:tc>
-      </w:tr>
-      <w:tr>
-        <w:tc>
-          <w:tcPr>
-            <w:tcW w:type="dxa" w:w="1500"/>
-            <w:tcMar>
-              <w:top w:type="dxa" w:w="70"/>
-              <w:left w:type="dxa" w:w="110"/>
-              <w:bottom w:type="dxa" w:w="70"/>
-              <w:right w:type="dxa" w:w="110"/>
-            </w:tcMar>
-          </w:tcPr>
-          <w:p>
-            <w:pPr>
-              <w:spacing w:after="0"/>
-            </w:pPr>
-            <w:r>
-              <w:rPr>
-                <w:b/>
-                <w:bCs/>
-                <w:color w:val="1A1A1A"/>
-                <w:sz w:val="19"/>
-                <w:szCs w:val="19"/>
-              </w:rPr>
-              <w:t xml:space="preserve">0:30–1:30</w:t>
-            </w:r>
-          </w:p>
-        </w:tc>
-        <w:tc>
-          <w:tcPr>
-            <w:tcW w:type="dxa" w:w="8200"/>
-            <w:tcMar>
-              <w:top w:type="dxa" w:w="70"/>
-              <w:left w:type="dxa" w:w="110"/>
-              <w:bottom w:type="dxa" w:w="70"/>
-              <w:right w:type="dxa" w:w="110"/>
-            </w:tcMar>
-          </w:tcPr>
-          <w:p>
-            <w:pPr>
-              <w:spacing w:after="0"/>
-            </w:pPr>
-            <w:r>
-              <w:rPr>
-                <w:color w:val="1A1A1A"/>
-                <w:sz w:val="19"/>
-                <w:szCs w:val="19"/>
-              </w:rPr>
-              <w:t xml:space="preserve">何者か＋主要指標4つ（14.0万=Spotify月間リスナー / 111万=「葡萄」Spotify再生 / SOLD OUT=初ワンマン 東京・大阪 両公演 / 130万=TikTok最大再生（葡萄クリップ））</w:t>
-            </w:r>
-          </w:p>
-        </w:tc>
-      </w:tr>
-      <w:tr>
-        <w:tc>
-          <w:tcPr>
-            <w:tcW w:type="dxa" w:w="1500"/>
-            <w:tcMar>
-              <w:top w:type="dxa" w:w="70"/>
-              <w:left w:type="dxa" w:w="110"/>
-              <w:bottom w:type="dxa" w:w="70"/>
-              <w:right w:type="dxa" w:w="110"/>
-            </w:tcMar>
-          </w:tcPr>
-          <w:p>
-            <w:pPr>
-              <w:spacing w:after="0"/>
-            </w:pPr>
-            <w:r>
-              <w:rPr>
-                <w:b/>
-                <w:bCs/>
-                <w:color w:val="1A1A1A"/>
-                <w:sz w:val="19"/>
-                <w:szCs w:val="19"/>
-              </w:rPr>
-              <w:t xml:space="preserve">1:30–2:30</w:t>
-            </w:r>
-          </w:p>
-        </w:tc>
-        <w:tc>
-          <w:tcPr>
-            <w:tcW w:type="dxa" w:w="8200"/>
-            <w:tcMar>
-              <w:top w:type="dxa" w:w="70"/>
-              <w:left w:type="dxa" w:w="110"/>
-              <w:bottom w:type="dxa" w:w="70"/>
-              <w:right w:type="dxa" w:w="110"/>
-            </w:tcMar>
-          </w:tcPr>
-          <w:p>
-            <w:pPr>
-              <w:spacing w:after="0"/>
-            </w:pPr>
-            <w:r>
-              <w:rPr>
-                <w:color w:val="1A1A1A"/>
-                <w:sz w:val="19"/>
-                <w:szCs w:val="19"/>
-              </w:rPr>
-              <w:t xml:space="preserve">参考動画①を再生：【本命】Vivanz Eden「葡萄」Music Video（YouTube・84万再生）</w:t>
-            </w:r>
-          </w:p>
-        </w:tc>
-      </w:tr>
-      <w:tr>
-        <w:tc>
-          <w:tcPr>
-            <w:tcW w:type="dxa" w:w="1500"/>
-            <w:tcMar>
-              <w:top w:type="dxa" w:w="70"/>
-              <w:left w:type="dxa" w:w="110"/>
-              <w:bottom w:type="dxa" w:w="70"/>
-              <w:right w:type="dxa" w:w="110"/>
-            </w:tcMar>
-          </w:tcPr>
-          <w:p>
-            <w:pPr>
-              <w:spacing w:after="0"/>
-            </w:pPr>
-            <w:r>
-              <w:rPr>
-                <w:b/>
-                <w:bCs/>
-                <w:color w:val="1A1A1A"/>
-                <w:sz w:val="19"/>
-                <w:szCs w:val="19"/>
-              </w:rPr>
-              <w:t xml:space="preserve">2:30–3:30</w:t>
-            </w:r>
-          </w:p>
-        </w:tc>
-        <w:tc>
-          <w:tcPr>
-            <w:tcW w:type="dxa" w:w="8200"/>
-            <w:tcMar>
-              <w:top w:type="dxa" w:w="70"/>
-              <w:left w:type="dxa" w:w="110"/>
-              <w:bottom w:type="dxa" w:w="70"/>
-              <w:right w:type="dxa" w:w="110"/>
-            </w:tcMar>
-          </w:tcPr>
-          <w:p>
-            <w:pPr>
-              <w:spacing w:after="0"/>
-            </w:pPr>
-            <w:r>
-              <w:rPr>
-                <w:color w:val="1A1A1A"/>
-                <w:sz w:val="19"/>
-                <w:szCs w:val="19"/>
-              </w:rPr>
-              <w:t xml:space="preserve">魅力の1点目と2点目に絞って話す：本命は菊地諒真のボーカル ／ 作詞作曲が本人</w:t>
-            </w:r>
-          </w:p>
-        </w:tc>
-      </w:tr>
-      <w:tr>
-        <w:tc>
-          <w:tcPr>
-            <w:tcW w:type="dxa" w:w="1500"/>
-            <w:tcMar>
-              <w:top w:type="dxa" w:w="70"/>
-              <w:left w:type="dxa" w:w="110"/>
-              <w:bottom w:type="dxa" w:w="70"/>
-              <w:right w:type="dxa" w:w="110"/>
-            </w:tcMar>
-          </w:tcPr>
-          <w:p>
-            <w:pPr>
-              <w:spacing w:after="0"/>
-            </w:pPr>
-            <w:r>
-              <w:rPr>
-                <w:b/>
-                <w:bCs/>
-                <w:color w:val="1A1A1A"/>
-                <w:sz w:val="19"/>
-                <w:szCs w:val="19"/>
-              </w:rPr>
-              <w:t xml:space="preserve">3:30–4:30</w:t>
-            </w:r>
-          </w:p>
-        </w:tc>
-        <w:tc>
-          <w:tcPr>
-            <w:tcW w:type="dxa" w:w="8200"/>
-            <w:tcMar>
-              <w:top w:type="dxa" w:w="70"/>
-              <w:left w:type="dxa" w:w="110"/>
-              <w:bottom w:type="dxa" w:w="70"/>
-              <w:right w:type="dxa" w:w="110"/>
-            </w:tcMar>
-          </w:tcPr>
-          <w:p>
-            <w:pPr>
-              <w:spacing w:after="0"/>
-            </w:pPr>
-            <w:r>
-              <w:rPr>
-                <w:color w:val="1A1A1A"/>
-                <w:sz w:val="19"/>
-                <w:szCs w:val="19"/>
-              </w:rPr>
-              <w:t xml:space="preserve">詰まりと打ち手：いま起きている“詰まり” → 菊地の声を主役に置いた制作体制に組み替える ／ 「葡萄」の当たりを曲の連打に変える</w:t>
-            </w:r>
-          </w:p>
-        </w:tc>
-      </w:tr>
-      <w:tr>
-        <w:tc>
-          <w:tcPr>
-            <w:tcW w:type="dxa" w:w="1500"/>
-            <w:tcMar>
-              <w:top w:type="dxa" w:w="70"/>
-              <w:left w:type="dxa" w:w="110"/>
-              <w:bottom w:type="dxa" w:w="70"/>
-              <w:right w:type="dxa" w:w="110"/>
-            </w:tcMar>
-          </w:tcPr>
-          <w:p>
-            <w:pPr>
-              <w:spacing w:after="0"/>
-            </w:pPr>
-            <w:r>
-              <w:rPr>
-                <w:b/>
-                <w:bCs/>
-                <w:color w:val="1A1A1A"/>
-                <w:sz w:val="19"/>
-                <w:szCs w:val="19"/>
-              </w:rPr>
-              <w:t xml:space="preserve">4:30–5:00</w:t>
-            </w:r>
-          </w:p>
-        </w:tc>
-        <w:tc>
-          <w:tcPr>
-            <w:tcW w:type="dxa" w:w="8200"/>
-            <w:tcMar>
-              <w:top w:type="dxa" w:w="70"/>
-              <w:left w:type="dxa" w:w="110"/>
-              <w:bottom w:type="dxa" w:w="70"/>
-              <w:right w:type="dxa" w:w="110"/>
-            </w:tcMar>
-          </w:tcPr>
-          <w:p>
-            <w:pPr>
-              <w:spacing w:after="0"/>
-            </w:pPr>
-            <w:r>
-              <w:rPr>
-                <w:color w:val="1A1A1A"/>
-                <w:sz w:val="19"/>
-                <w:szCs w:val="19"/>
-              </w:rPr>
-              <w:t xml:space="preserve">アスク：8月ワンマン（8/15大阪・8/28東京）に同行して現場確認したい。前回提出案件のため、菊地個人軸での再提案として扱いたい。</w:t>
-            </w:r>
-          </w:p>
-        </w:tc>
-      </w:tr>
-    </w:tbl>
-    <w:p>
-      <w:r>
-        <w:br w:type="page"/>
-      </w:r>
-    </w:p>
-    <w:p>
-      <w:pPr>
-        <w:pStyle w:val="Heading1"/>
-        <w:spacing w:after="160" w:before="320"/>
-      </w:pPr>
-      <w:r>
-        <w:rPr>
-          <w:b/>
-          <w:bCs/>
-          <w:color w:val="1A1A1A"/>
-          <w:sz w:val="30"/>
-          <w:szCs w:val="30"/>
-        </w:rPr>
-        <w:t xml:space="preserve">5. 追加候補枠（別途リサーチ中）</w:t>
+        <w:t xml:space="preserve">4. 追加候補枠（別途リサーチ中）</w:t>
       </w:r>
     </w:p>
     <w:p>
@@ -10418,7 +8120,7 @@
           <w:sz w:val="30"/>
           <w:szCs w:val="30"/>
         </w:rPr>
-        <w:t xml:space="preserve">6. まとめ ／ 本日のアスク</w:t>
+        <w:t xml:space="preserve">5. まとめ ／ 本日のアスク</w:t>
       </w:r>
     </w:p>
     <w:p>
@@ -10454,15 +8156,15 @@
           <w:sz w:val="21"/>
           <w:szCs w:val="21"/>
         </w:rPr>
-        <w:t xml:space="preserve">saewool　</w:t>
-      </w:r>
-      <w:r>
-        <w:rPr>
-          <w:color w:val="1A1A1A"/>
-          <w:sz w:val="21"/>
-          <w:szCs w:val="21"/>
-        </w:rPr>
-        <w:t xml:space="preserve">アニメ／ゲームIPタイアップの枠出しと、公式カバーEPの許諾可否を確認したい。韓国在住のため契約スキームの相談も。</w:t>
+        <w:t xml:space="preserve">Vivanz Eden（菊地諒真）　</w:t>
+      </w:r>
+      <w:r>
+        <w:rPr>
+          <w:color w:val="1A1A1A"/>
+          <w:sz w:val="21"/>
+          <w:szCs w:val="21"/>
+        </w:rPr>
+        <w:t xml:space="preserve">8月ワンマン（8/15大阪・8/28東京）に同行して現場確認したい。前回提出案件のため、菊地個人軸での再提案として扱いたい。</w:t>
       </w:r>
     </w:p>
     <w:p>
@@ -10523,42 +8225,14 @@
     </w:p>
     <w:p>
       <w:pPr>
-        <w:pStyle w:val="ListParagraph"/>
-        <w:numPr>
-          <w:ilvl w:val="0"/>
-          <w:numId w:val="2"/>
-        </w:numPr>
-        <w:spacing w:after="110"/>
+        <w:pStyle w:val="Heading2"/>
+        <w:spacing w:after="110" w:before="240"/>
       </w:pPr>
       <w:r>
         <w:rPr>
           <w:b/>
           <w:bCs/>
           <w:color w:val="1A1A1A"/>
-          <w:sz w:val="21"/>
-          <w:szCs w:val="21"/>
-        </w:rPr>
-        <w:t xml:space="preserve">Vivanz Eden（菊地諒真）　</w:t>
-      </w:r>
-      <w:r>
-        <w:rPr>
-          <w:color w:val="1A1A1A"/>
-          <w:sz w:val="21"/>
-          <w:szCs w:val="21"/>
-        </w:rPr>
-        <w:t xml:space="preserve">8月ワンマン（8/15大阪・8/28東京）に同行して現場確認したい。前回提出案件のため、菊地個人軸での再提案として扱いたい。</w:t>
-      </w:r>
-    </w:p>
-    <w:p>
-      <w:pPr>
-        <w:pStyle w:val="Heading2"/>
-        <w:spacing w:after="110" w:before="240"/>
-      </w:pPr>
-      <w:r>
-        <w:rPr>
-          <w:b/>
-          <w:bCs/>
-          <w:color w:val="1A1A1A"/>
           <w:sz w:val="23"/>
           <w:szCs w:val="23"/>
         </w:rPr>
@@ -10575,7 +8249,7 @@
           <w:sz w:val="21"/>
           <w:szCs w:val="21"/>
         </w:rPr>
-        <w:t xml:space="preserve">スピード優先度は yuuna ＞ Ryudai ＞ Vivanz Eden ＞ saewool。yuuna / Ryudai は窓口が公開されており他社も同条件でアクセスできる。Vivanz Eden は8月ワンマン後に他社接触が増える想定。</w:t>
+        <w:t xml:space="preserve">スピード優先度は Vivanz Eden ＞ yuuna ＞ Ryudai。Vivanz Eden は8月の初ワンマン（8/15・8/28）が両日SOLD OUTで、公演後に他社接触が増える想定のため最優先。yuuna / Ryudai は窓口が公開されており他社も同条件でアクセスできるため、接触の早さがそのまま勝敗になる。</w:t>
       </w:r>
     </w:p>
     <w:p>
@@ -10874,7 +8548,7 @@
                 <w:sz w:val="19"/>
                 <w:szCs w:val="19"/>
               </w:rPr>
-              <w:t xml:space="preserve">saewool</w:t>
+              <w:t xml:space="preserve">Vivanz Eden（Vo. 菊地諒真）</w:t>
             </w:r>
           </w:p>
         </w:tc>
@@ -10898,7 +8572,7 @@
                 <w:sz w:val="15"/>
                 <w:szCs w:val="15"/>
               </w:rPr>
-              <w:t xml:space="preserve">https://www.tiktok.com/@saewool</w:t>
+              <w:t xml:space="preserve">https://www.tiktok.com/@vivanzeden_jp</w:t>
             </w:r>
           </w:p>
         </w:tc>
@@ -10922,7 +8596,7 @@
                 <w:sz w:val="15"/>
                 <w:szCs w:val="15"/>
               </w:rPr>
-              <w:t xml:space="preserve">弾き語りシンガー／ソロ／レーベル未所属（TuneCore Japanで自主配信）</w:t>
+              <w:t xml:space="preserve">3ピースバンド／本命は菊地のボーカル／インディペンデント（レーベル未所属／自主流通・ライブは自力で完売）</w:t>
             </w:r>
           </w:p>
         </w:tc>
@@ -11215,152 +8889,6 @@
                 <w:szCs w:val="15"/>
               </w:rPr>
               <w:t xml:space="preserve">ダンサー／ソロ・大阪／レーベル未所属（音源リリースなし・ダンサーとして活動）</w:t>
-            </w:r>
-          </w:p>
-        </w:tc>
-      </w:tr>
-      <w:tr>
-        <w:tc>
-          <w:tcPr>
-            <w:tcW w:type="dxa" w:w="520"/>
-            <w:tcMar>
-              <w:top w:type="dxa" w:w="70"/>
-              <w:left w:type="dxa" w:w="110"/>
-              <w:bottom w:type="dxa" w:w="70"/>
-              <w:right w:type="dxa" w:w="110"/>
-            </w:tcMar>
-          </w:tcPr>
-          <w:p>
-            <w:pPr>
-              <w:spacing w:after="0"/>
-            </w:pPr>
-            <w:r>
-              <w:rPr>
-                <w:color w:val="1A1A1A"/>
-                <w:sz w:val="19"/>
-                <w:szCs w:val="19"/>
-              </w:rPr>
-              <w:t xml:space="preserve">4</w:t>
-            </w:r>
-          </w:p>
-        </w:tc>
-        <w:tc>
-          <w:tcPr>
-            <w:tcW w:type="dxa" w:w="1500"/>
-            <w:tcMar>
-              <w:top w:type="dxa" w:w="70"/>
-              <w:left w:type="dxa" w:w="110"/>
-              <w:bottom w:type="dxa" w:w="70"/>
-              <w:right w:type="dxa" w:w="110"/>
-            </w:tcMar>
-          </w:tcPr>
-          <w:p>
-            <w:pPr>
-              <w:spacing w:after="0"/>
-            </w:pPr>
-            <w:r>
-              <w:rPr>
-                <w:color w:val="1A1A1A"/>
-                <w:sz w:val="19"/>
-                <w:szCs w:val="19"/>
-              </w:rPr>
-              <w:t xml:space="preserve">SMAR1</w:t>
-            </w:r>
-          </w:p>
-        </w:tc>
-        <w:tc>
-          <w:tcPr>
-            <w:tcW w:type="dxa" w:w="900"/>
-            <w:tcMar>
-              <w:top w:type="dxa" w:w="70"/>
-              <w:left w:type="dxa" w:w="110"/>
-              <w:bottom w:type="dxa" w:w="70"/>
-              <w:right w:type="dxa" w:w="110"/>
-            </w:tcMar>
-          </w:tcPr>
-          <w:p>
-            <w:pPr>
-              <w:spacing w:after="0"/>
-            </w:pPr>
-            <w:r>
-              <w:rPr>
-                <w:color w:val="1A1A1A"/>
-                <w:sz w:val="19"/>
-                <w:szCs w:val="19"/>
-              </w:rPr>
-              <w:t xml:space="preserve">手塚</w:t>
-            </w:r>
-          </w:p>
-        </w:tc>
-        <w:tc>
-          <w:tcPr>
-            <w:tcW w:type="dxa" w:w="2300"/>
-            <w:tcMar>
-              <w:top w:type="dxa" w:w="70"/>
-              <w:left w:type="dxa" w:w="110"/>
-              <w:bottom w:type="dxa" w:w="70"/>
-              <w:right w:type="dxa" w:w="110"/>
-            </w:tcMar>
-          </w:tcPr>
-          <w:p>
-            <w:pPr>
-              <w:spacing w:after="0"/>
-            </w:pPr>
-            <w:r>
-              <w:rPr>
-                <w:color w:val="1A1A1A"/>
-                <w:sz w:val="19"/>
-                <w:szCs w:val="19"/>
-              </w:rPr>
-              <w:t xml:space="preserve">Vivanz Eden（Vo. 菊地諒真）</w:t>
-            </w:r>
-          </w:p>
-        </w:tc>
-        <w:tc>
-          <w:tcPr>
-            <w:tcW w:type="dxa" w:w="2680"/>
-            <w:tcMar>
-              <w:top w:type="dxa" w:w="70"/>
-              <w:left w:type="dxa" w:w="110"/>
-              <w:bottom w:type="dxa" w:w="70"/>
-              <w:right w:type="dxa" w:w="110"/>
-            </w:tcMar>
-          </w:tcPr>
-          <w:p>
-            <w:pPr>
-              <w:spacing w:after="0"/>
-            </w:pPr>
-            <w:r>
-              <w:rPr>
-                <w:color w:val="1A1A1A"/>
-                <w:sz w:val="15"/>
-                <w:szCs w:val="15"/>
-              </w:rPr>
-              <w:t xml:space="preserve">https://www.tiktok.com/@vivanzeden_jp</w:t>
-            </w:r>
-          </w:p>
-        </w:tc>
-        <w:tc>
-          <w:tcPr>
-            <w:tcW w:type="dxa" w:w="1800"/>
-            <w:tcMar>
-              <w:top w:type="dxa" w:w="70"/>
-              <w:left w:type="dxa" w:w="110"/>
-              <w:bottom w:type="dxa" w:w="70"/>
-              <w:right w:type="dxa" w:w="110"/>
-            </w:tcMar>
-          </w:tcPr>
-          <w:p>
-            <w:pPr>
-              <w:spacing w:after="0"/>
-            </w:pPr>
-            <w:r>
-              <w:rPr>
-                <w:color w:val="1A1A1A"/>
-                <w:sz w:val="15"/>
-                <w:szCs w:val="15"/>
-              </w:rPr>
-              <w:t xml:space="preserve">3ピースバンド／本命は菊地のボーカル／インディペンデント（レーベル未所属／自主流通・ライブは自力で完売）</w:t>
             </w:r>
           </w:p>
         </w:tc>

</xml_diff>